<commit_message>
feat: model API transport retry for agent loop resilience
Survive transient OpenRouter/provider failures (idle timeout, 502/503,
rate limits) without killing the agent loop on the first transport error.

Rust (agent_core @ 228fd44):
- submit_model_turn_failure with ModelApiRetryScheduled and backoff policy
- Regenerated UniFFI bindings and arm64 libagent_core.so

Kotlin:
- ModelTurnFailureClassifier and shared ModelApiTransportHeuristics
- Adapter reports failures to Rust; honors retry_after_ms backoff
- Clear partial streamed text and surface ModelApiRetryScheduled in UI
- Architecture doc section 9 updated

Tests: MAR-01..07 (Rust), MAR-K-* and FSIE stand-ins (Kotlin)
</commit_message>
<xml_diff>
--- a/docs/agent_core_architecture.docx
+++ b/docs/agent_core_architecture.docx
@@ -1,2401 +1,2425 @@
 
 <file path=word/document.xml><?xml version="1.0" encoding="utf-8"?>
-<w:document xmlns:wpc="http://schemas.microsoft.com/office/word/2010/wordprocessingCanvas" xmlns:mo="http://schemas.microsoft.com/office/mac/office/2008/main" xmlns:mc="http://schemas.openxmlformats.org/markup-compatibility/2006" xmlns:mv="urn:schemas-microsoft-com:mac:vml" xmlns:o="urn:schemas-microsoft-com:office:office" xmlns:r="http://schemas.openxmlformats.org/officeDocument/2006/relationships" xmlns:m="http://schemas.openxmlformats.org/officeDocument/2006/math" xmlns:v="urn:schemas-microsoft-com:vml" xmlns:wp14="http://schemas.microsoft.com/office/word/2010/wordprocessingDrawing" xmlns:wp="http://schemas.openxmlformats.org/drawingml/2006/wordprocessingDrawing" xmlns:w10="urn:schemas-microsoft-com:office:word" xmlns:w="http://schemas.openxmlformats.org/wordprocessingml/2006/main" xmlns:w14="http://schemas.microsoft.com/office/word/2010/wordml" xmlns:wpg="http://schemas.microsoft.com/office/word/2010/wordprocessingGroup" xmlns:wpi="http://schemas.microsoft.com/office/word/2010/wordprocessingInk" xmlns:wne="http://schemas.microsoft.com/office/word/2006/wordml" xmlns:wps="http://schemas.microsoft.com/office/word/2010/wordprocessingShape" mc:Ignorable="w14 wp14">
-  <w:body>
-    <w:p>
-      <w:pPr>
-        <w:pStyle w:val="Title"/>
-        <w:jc w:val="center"/>
-      </w:pPr>
-      <w:r>
-        <w:t>Pocket Crew Agent Core Architecture</w:t>
-      </w:r>
-    </w:p>
-    <w:p>
-      <w:r>
-        <w:rPr>
-          <w:b w:val="0"/>
-          <w:i w:val="0"/>
-          <w:sz w:val="22"/>
-        </w:rPr>
-      </w:r>
-    </w:p>
-    <w:p>
-      <w:pPr>
-        <w:jc w:val="center"/>
-      </w:pPr>
-      <w:r>
-        <w:rPr>
-          <w:b/>
-          <w:i w:val="0"/>
-          <w:sz w:val="22"/>
-        </w:rPr>
-        <w:t>High-Level Architecture Overview</w:t>
-      </w:r>
-    </w:p>
-    <w:p>
-      <w:r>
-        <w:rPr>
-          <w:b w:val="0"/>
-          <w:i w:val="0"/>
-          <w:sz w:val="22"/>
-        </w:rPr>
-        <w:t>How agent_core (Rust) interacts with Kotlin code, including the agent loop, tool calling, parsing, and compaction systems.</w:t>
-      </w:r>
-    </w:p>
-    <w:p>
-      <w:r>
-        <w:rPr>
-          <w:b w:val="0"/>
-          <w:i w:val="0"/>
-          <w:sz w:val="22"/>
-        </w:rPr>
-      </w:r>
-    </w:p>
-    <w:p>
-      <w:r>
-        <w:rPr>
-          <w:b w:val="0"/>
-          <w:i/>
-          <w:sz w:val="22"/>
-        </w:rPr>
-        <w:t>Generated: 2026-05-18</w:t>
-      </w:r>
-    </w:p>
-    <w:p>
-      <w:r>
-        <w:br w:type="page"/>
-      </w:r>
-    </w:p>
-    <w:p>
-      <w:pPr>
-        <w:pStyle w:val="Heading1"/>
-      </w:pPr>
-      <w:r>
-        <w:t>Table of Contents</w:t>
-      </w:r>
-    </w:p>
-    <w:p>
-      <w:r>
-        <w:rPr>
-          <w:b w:val="0"/>
-          <w:i w:val="0"/>
-          <w:sz w:val="22"/>
-        </w:rPr>
-        <w:t>1. Architecture Overview</w:t>
-      </w:r>
-    </w:p>
-    <w:p>
-      <w:r>
-        <w:rPr>
-          <w:b w:val="0"/>
-          <w:i w:val="0"/>
-          <w:sz w:val="22"/>
-        </w:rPr>
-        <w:t>2. The Agent Loop (Rust Engine)</w:t>
-      </w:r>
-    </w:p>
-    <w:p>
-      <w:r>
-        <w:rPr>
-          <w:b w:val="0"/>
-          <w:i w:val="0"/>
-          <w:sz w:val="22"/>
-        </w:rPr>
-        <w:t xml:space="preserve">   2.1 State Machine</w:t>
-      </w:r>
-    </w:p>
-    <w:p>
-      <w:r>
-        <w:rPr>
-          <w:b w:val="0"/>
-          <w:i w:val="0"/>
-          <w:sz w:val="22"/>
-        </w:rPr>
-        <w:t xml:space="preserve">   2.2 Submit-Style Protocol</w:t>
-      </w:r>
-    </w:p>
-    <w:p>
-      <w:r>
-        <w:rPr>
-          <w:b w:val="0"/>
-          <w:i w:val="0"/>
-          <w:sz w:val="22"/>
-        </w:rPr>
-        <w:t xml:space="preserve">   2.3 Envelope Parsing</w:t>
-      </w:r>
-    </w:p>
-    <w:p>
-      <w:r>
-        <w:rPr>
-          <w:b w:val="0"/>
-          <w:i w:val="0"/>
-          <w:sz w:val="22"/>
-        </w:rPr>
-        <w:t xml:space="preserve">   2.4 Tool Repair Pipeline</w:t>
-      </w:r>
-    </w:p>
-    <w:p>
-      <w:r>
-        <w:rPr>
-          <w:b w:val="0"/>
-          <w:i w:val="0"/>
-          <w:sz w:val="22"/>
-        </w:rPr>
-        <w:t xml:space="preserve">   2.5 Compaction Tiers</w:t>
-      </w:r>
-    </w:p>
-    <w:p>
-      <w:r>
-        <w:rPr>
-          <w:b w:val="0"/>
-          <w:i w:val="0"/>
-          <w:sz w:val="22"/>
-        </w:rPr>
-        <w:t xml:space="preserve">   2.6 Guardrails</w:t>
-      </w:r>
-    </w:p>
-    <w:p>
-      <w:r>
-        <w:rPr>
-          <w:b w:val="0"/>
-          <w:i w:val="0"/>
-          <w:sz w:val="22"/>
-        </w:rPr>
-        <w:t>3. UniFFI Bridge (core/agent)</w:t>
-      </w:r>
-    </w:p>
-    <w:p>
-      <w:r>
-        <w:rPr>
-          <w:b w:val="0"/>
-          <w:i w:val="0"/>
-          <w:sz w:val="22"/>
-        </w:rPr>
-        <w:t xml:space="preserve">   3.1 How UniFFI Connects Rust to Kotlin</w:t>
-      </w:r>
-    </w:p>
-    <w:p>
-      <w:r>
-        <w:rPr>
-          <w:b w:val="0"/>
-          <w:i w:val="0"/>
-          <w:sz w:val="22"/>
-        </w:rPr>
-        <w:t xml:space="preserve">   3.2 Kotlin Adapter Classes</w:t>
-      </w:r>
-    </w:p>
-    <w:p>
-      <w:r>
-        <w:rPr>
-          <w:b w:val="0"/>
-          <w:i w:val="0"/>
-          <w:sz w:val="22"/>
-        </w:rPr>
-        <w:t>4. Kotlin Feature Layer (feature/inference)</w:t>
-      </w:r>
-    </w:p>
-    <w:p>
-      <w:r>
-        <w:rPr>
-          <w:b w:val="0"/>
-          <w:i w:val="0"/>
-          <w:sz w:val="22"/>
-        </w:rPr>
-        <w:t xml:space="preserve">   4.1 Inference Services</w:t>
-      </w:r>
-    </w:p>
-    <w:p>
-      <w:r>
-        <w:rPr>
-          <w:b w:val="0"/>
-          <w:i w:val="0"/>
-          <w:sz w:val="22"/>
-        </w:rPr>
-        <w:t xml:space="preserve">   4.2 The Agent Loop from Kotlin's Perspective</w:t>
-      </w:r>
-    </w:p>
-    <w:p>
-      <w:r>
-        <w:rPr>
-          <w:b w:val="0"/>
-          <w:i w:val="0"/>
-          <w:sz w:val="22"/>
-        </w:rPr>
-        <w:t xml:space="preserve">   4.3 Tool Execution Flow</w:t>
-      </w:r>
-    </w:p>
-    <w:p>
-      <w:r>
-        <w:rPr>
-          <w:b w:val="0"/>
-          <w:i w:val="0"/>
-          <w:sz w:val="22"/>
-        </w:rPr>
-        <w:t xml:space="preserve">   4.4 Streaming and the Tool Stream Gate</w:t>
-      </w:r>
-    </w:p>
-    <w:p>
-      <w:r>
-        <w:rPr>
-          <w:b w:val="0"/>
-          <w:i w:val="0"/>
-          <w:sz w:val="22"/>
-        </w:rPr>
-        <w:t>5. Complete Lifecycle: A User Message</w:t>
-      </w:r>
-    </w:p>
-    <w:p>
-      <w:r>
-        <w:rPr>
-          <w:b w:val="0"/>
-          <w:i w:val="0"/>
-          <w:sz w:val="22"/>
-        </w:rPr>
-        <w:t>6. Compaction in Detail</w:t>
-      </w:r>
-    </w:p>
-    <w:p>
-      <w:r>
-        <w:rPr>
-          <w:b w:val="0"/>
-          <w:i w:val="0"/>
-          <w:sz w:val="22"/>
-        </w:rPr>
-        <w:t>7. Standalone Policy Functions</w:t>
-      </w:r>
-    </w:p>
-    <w:p>
-      <w:r>
-        <w:rPr>
-          <w:b w:val="0"/>
-          <w:i w:val="0"/>
-          <w:sz w:val="22"/>
-        </w:rPr>
-        <w:t>8. Key Configuration (AgentConfig)</w:t>
-      </w:r>
-    </w:p>
-    <w:p>
-      <w:r>
-        <w:rPr>
-          <w:b w:val="0"/>
-          <w:i w:val="0"/>
-          <w:sz w:val="22"/>
-        </w:rPr>
-        <w:t>9. Error Handling and Self-Healing</w:t>
-      </w:r>
-    </w:p>
-    <w:p>
-      <w:r>
-        <w:rPr>
-          <w:b w:val="0"/>
-          <w:i w:val="0"/>
-          <w:sz w:val="22"/>
-        </w:rPr>
-        <w:t>10. Threading Model</w:t>
-      </w:r>
-    </w:p>
-    <w:p>
-      <w:r>
-        <w:rPr>
-          <w:b w:val="0"/>
-          <w:i w:val="0"/>
-          <w:sz w:val="22"/>
-        </w:rPr>
-        <w:t>11. Binding Regeneration</w:t>
-      </w:r>
-    </w:p>
-    <w:p>
-      <w:r>
-        <w:rPr>
-          <w:b w:val="0"/>
-          <w:i w:val="0"/>
-          <w:sz w:val="22"/>
-        </w:rPr>
-        <w:t>12. Visual Summary: Data Flow</w:t>
-      </w:r>
-    </w:p>
-    <w:p>
-      <w:r>
-        <w:rPr>
-          <w:b w:val="0"/>
-          <w:i w:val="0"/>
-          <w:sz w:val="22"/>
-        </w:rPr>
-        <w:t>13. Module Map</w:t>
-      </w:r>
-    </w:p>
-    <w:p>
-      <w:r>
-        <w:rPr>
-          <w:b w:val="0"/>
-          <w:i w:val="0"/>
-          <w:sz w:val="22"/>
-        </w:rPr>
-        <w:t>14. Summary</w:t>
-      </w:r>
-    </w:p>
-    <w:p>
-      <w:r>
-        <w:br w:type="page"/>
-      </w:r>
-    </w:p>
-    <w:p>
-      <w:pPr>
-        <w:pStyle w:val="Heading1"/>
-      </w:pPr>
-      <w:r>
-        <w:t>1. Architecture Overview</w:t>
-      </w:r>
-    </w:p>
-    <w:p>
-      <w:r>
-        <w:rPr>
-          <w:b w:val="0"/>
-          <w:i w:val="0"/>
-          <w:sz w:val="22"/>
-        </w:rPr>
-        <w:t>Pocket Crew uses a hybrid Rust/Kotlin architecture for its agent loop. The Rust agent_core crate (in third_party/agent_core/) owns all deterministic agent-loop logic: state machine transitions, tool call parsing and repair, context compaction, guardrails, and session management. The Kotlin/Android layer (core/agent/ and feature/inference/) owns all I/O: calling model providers, executing tools, and generating summaries.</w:t>
-      </w:r>
-    </w:p>
-    <w:p>
-      <w:r>
-        <w:rPr>
-          <w:b w:val="0"/>
-          <w:i w:val="0"/>
-          <w:sz w:val="22"/>
-        </w:rPr>
-        <w:t>The two layers communicate through a submit-style protocol over UniFFI (Mozilla's foreign-function interface generator). Rust yields actions (CallModel, ExecuteTools, RequestSummary, Finished) and Kotlin fulfills them. This design ensures that all policy decisions live in one place (Rust) and are fully testable without an Android device, while the Android layer remains a thin orchestration shell.</w:t>
-      </w:r>
-    </w:p>
-    <w:p>
-      <w:r>
-        <w:rPr>
-          <w:b/>
-          <w:i w:val="0"/>
-          <w:sz w:val="22"/>
-        </w:rPr>
-        <w:t>The key architectural principle: Rust decides, Kotlin acts.</w:t>
-      </w:r>
-    </w:p>
-    <w:p>
-      <w:r>
-        <w:rPr>
-          <w:b w:val="0"/>
-          <w:i w:val="0"/>
-          <w:sz w:val="22"/>
-        </w:rPr>
-        <w:t>The Rust engine never directly calls a model API, executes a tool, or touches Android frameworks. Instead, it yields an action like CallModel, and the Kotlin adapter calls the appropriate inference service, then submits the response back via submitModelResponse(). This inversion of control means the Rust engine can be unit-tested with pure data inputs and outputs, without mocking HTTP clients or Android services.</w:t>
-      </w:r>
-    </w:p>
-    <w:p>
-      <w:pPr>
-        <w:pStyle w:val="Heading1"/>
-      </w:pPr>
-      <w:r>
-        <w:t>2. The Agent Loop (Rust Engine)</w:t>
-      </w:r>
-    </w:p>
-    <w:p>
-      <w:pPr>
-        <w:pStyle w:val="Heading2"/>
-      </w:pPr>
-      <w:r>
-        <w:t>2.1 State Machine</w:t>
-      </w:r>
-    </w:p>
-    <w:p>
-      <w:r>
-        <w:rPr>
-          <w:b w:val="0"/>
-          <w:i w:val="0"/>
-          <w:sz w:val="22"/>
-        </w:rPr>
-        <w:t>The agent loop is a finite state machine with these phases:</w:t>
-      </w:r>
-    </w:p>
-    <w:p>
-      <w:pPr>
-        <w:pStyle w:val="ListBullet"/>
-      </w:pPr>
-      <w:r>
-        <w:t>Idle: Preparing to request a model turn. Runs preflight compaction if needed, then yields CallModel.</w:t>
-      </w:r>
-    </w:p>
-    <w:p>
-      <w:pPr>
-        <w:pStyle w:val="ListBullet"/>
-      </w:pPr>
-      <w:r>
-        <w:t>AwaitingModel: Waiting for Kotlin to complete a model inference turn and submit the response.</w:t>
-      </w:r>
-    </w:p>
-    <w:p>
-      <w:pPr>
-        <w:pStyle w:val="ListBullet"/>
-      </w:pPr>
-      <w:r>
-        <w:t>ProcessingModelResponse: Parsing tool calls from model output, running repair, checking guardrails, running mid-turn compaction.</w:t>
-      </w:r>
-    </w:p>
-    <w:p>
-      <w:pPr>
-        <w:pStyle w:val="ListBullet"/>
-      </w:pPr>
-      <w:r>
-        <w:t>AwaitingTools: Waiting for Kotlin to execute tool calls and submit results.</w:t>
-      </w:r>
-    </w:p>
-    <w:p>
-      <w:pPr>
-        <w:pStyle w:val="ListBullet"/>
-      </w:pPr>
-      <w:r>
-        <w:t>ProcessingToolResults: Truncating results, spilling to ContextStore, checking for soft failures, running post-tool-result compaction.</w:t>
-      </w:r>
-    </w:p>
-    <w:p>
-      <w:pPr>
-        <w:pStyle w:val="ListBullet"/>
-      </w:pPr>
-      <w:r>
-        <w:t>AwaitingSummary: Waiting for Kotlin to generate a summary of a message range.</w:t>
-      </w:r>
-    </w:p>
-    <w:p>
-      <w:pPr>
-        <w:pStyle w:val="ListBullet"/>
-      </w:pPr>
-      <w:r>
-        <w:t>Finished: Session complete, loop exits.</w:t>
-      </w:r>
-    </w:p>
-    <w:p>
-      <w:pPr>
-        <w:pStyle w:val="ListBullet"/>
-      </w:pPr>
-      <w:r>
-        <w:t>Failed: Unrecoverable error, loop exits with error.</w:t>
-      </w:r>
-    </w:p>
-    <w:p>
-      <w:r>
-        <w:rPr>
-          <w:b w:val="0"/>
-          <w:i w:val="0"/>
-          <w:sz w:val="22"/>
-        </w:rPr>
-        <w:t>Each transition is deterministic: given the same session state and submitted data, the engine always makes the same decision. The only non-determinism comes from the model output and tool results, both of which originate outside the engine.</w:t>
-      </w:r>
-    </w:p>
-    <w:p>
-      <w:pPr>
-        <w:pStyle w:val="Heading2"/>
-      </w:pPr>
-      <w:r>
-        <w:t>2.2 Submit-Style Protocol</w:t>
-      </w:r>
-    </w:p>
-    <w:p>
-      <w:r>
-        <w:rPr>
-          <w:b w:val="0"/>
-          <w:i w:val="0"/>
-          <w:sz w:val="22"/>
-        </w:rPr>
-        <w:t>The engine uses a submit-style (co-routine-like) protocol rather than callbacks. The flow is:</w:t>
-      </w:r>
-    </w:p>
-    <w:p>
-      <w:pPr>
-        <w:pStyle w:val="ListNumber"/>
-      </w:pPr>
-      <w:r>
-        <w:t>Kotlin calls nextAction(session) to get the next action.</w:t>
-      </w:r>
-    </w:p>
-    <w:p>
-      <w:pPr>
-        <w:pStyle w:val="ListNumber"/>
-      </w:pPr>
-      <w:r>
-        <w:t>Rust returns an AgentAction variant (CallModel, ExecuteTools, RequestSummary, Finished, Failed).</w:t>
-      </w:r>
-    </w:p>
-    <w:p>
-      <w:pPr>
-        <w:pStyle w:val="ListNumber"/>
-      </w:pPr>
-      <w:r>
-        <w:t>Kotlin fulfills the action (calls model, executes tools, generates summary).</w:t>
-      </w:r>
-    </w:p>
-    <w:p>
-      <w:pPr>
-        <w:pStyle w:val="ListNumber"/>
-      </w:pPr>
-      <w:r>
-        <w:t>Kotlin calls submitModelResponse(), submitToolResults(), or submitSummary() to feed results back.</w:t>
-      </w:r>
-    </w:p>
-    <w:p>
-      <w:pPr>
-        <w:pStyle w:val="ListNumber"/>
-      </w:pPr>
-      <w:r>
-        <w:t>Rust processes the submitted data, updates session state, and returns to step 1.</w:t>
-      </w:r>
-    </w:p>
-    <w:p>
-      <w:r>
-        <w:rPr>
-          <w:b w:val="0"/>
-          <w:i w:val="0"/>
-          <w:sz w:val="22"/>
-        </w:rPr>
-        <w:t>This style is preferred over callbacks because it avoids complex lifetime management across the FFI boundary and makes the control flow explicit and easy to test.</w:t>
-      </w:r>
-    </w:p>
-    <w:p>
-      <w:pPr>
-        <w:pStyle w:val="Heading2"/>
-      </w:pPr>
-      <w:r>
-        <w:t>2.3 Envelope Parsing</w:t>
-      </w:r>
-    </w:p>
-    <w:p>
-      <w:r>
-        <w:rPr>
-          <w:b w:val="0"/>
-          <w:i w:val="0"/>
-          <w:sz w:val="22"/>
-        </w:rPr>
-        <w:t>Many LLM providers (especially on-device models) do not support native tool calling. Instead, the model emits tool calls as text embedded in its response. The Rust engine's envelope parser extracts these from free-form text. Supported envelope formats include:</w:t>
-      </w:r>
-    </w:p>
-    <w:p>
-      <w:pPr>
-        <w:pStyle w:val="ListBullet"/>
-      </w:pPr>
-      <w:r>
-        <w:t>XML tags (Claude-style)</w:t>
-      </w:r>
-    </w:p>
-    <w:p>
-      <w:pPr>
-        <w:pStyle w:val="ListBullet"/>
-      </w:pPr>
-      <w:r>
-        <w:t>```tool_calls JSON code blocks</w:t>
-      </w:r>
-    </w:p>
-    <w:p>
-      <w:pPr>
-        <w:pStyle w:val="ListBullet"/>
-      </w:pPr>
-      <w:r>
-        <w:t>Anthropic-style XML tags</w:t>
-      </w:r>
-    </w:p>
-    <w:p>
-      <w:pPr>
-        <w:pStyle w:val="ListBullet"/>
-      </w:pPr>
-      <w:r>
-        <w:t>[TOOL_CALLS] JSON arrays (Mistral-style)</w:t>
-      </w:r>
-    </w:p>
-    <w:p>
-      <w:pPr>
-        <w:pStyle w:val="ListBullet"/>
-      </w:pPr>
-      <w:r>
-        <w:t>DSML &lt;invoke name="..."&gt; markup (DeepSeek/GitHub Copilot-style)</w:t>
-      </w:r>
-    </w:p>
-    <w:p>
-      <w:pPr>
-        <w:pStyle w:val="ListBullet"/>
-      </w:pPr>
-      <w:r>
-        <w:t>&lt;![CDATA[&lt;tool&gt;...&lt;/tool&gt;]]&gt; CDATA envelopes</w:t>
-      </w:r>
-    </w:p>
-    <w:p>
-      <w:pPr>
-        <w:pStyle w:val="ListBullet"/>
-      </w:pPr>
-      <w:r>
-        <w:t>Raw JSON objects with "name" fields (OpenAI function calling)</w:t>
-      </w:r>
-    </w:p>
-    <w:p>
-      <w:pPr>
-        <w:pStyle w:val="ListBullet"/>
-      </w:pPr>
-      <w:r>
-        <w:t>GLM-style name&lt;key&gt;value&lt;/key&gt; inline format</w:t>
-      </w:r>
-    </w:p>
-    <w:p>
-      <w:r>
-        <w:rPr>
-          <w:b w:val="0"/>
-          <w:i w:val="0"/>
-          <w:sz w:val="22"/>
-        </w:rPr>
-        <w:t>Each extracted envelope goes through JSON repair (fixing single quotes, trailing commas, bracket escaping) and then through the full repair + coercion pipeline described above.</w:t>
-      </w:r>
-    </w:p>
-    <w:p>
-      <w:pPr>
-        <w:pStyle w:val="Heading2"/>
-      </w:pPr>
-      <w:r>
-        <w:t>2.4 Tool Repair Pipeline</w:t>
-      </w:r>
-    </w:p>
-    <w:p>
-      <w:r>
-        <w:rPr>
-          <w:b w:val="0"/>
-          <w:i w:val="0"/>
-          <w:sz w:val="22"/>
-        </w:rPr>
-        <w:t>When an envelope is parsed, the ToolRepairPipeline runs:</w:t>
-      </w:r>
-    </w:p>
-    <w:p>
-      <w:pPr>
-        <w:pStyle w:val="ListNumber"/>
-      </w:pPr>
-      <w:r>
-        <w:t>Name normalization: Strip "functions." or "tools." prefixes, convert hyphens/spaces to underscores, lowercase.</w:t>
-      </w:r>
-    </w:p>
-    <w:p>
-      <w:pPr>
-        <w:pStyle w:val="ListNumber"/>
-      </w:pPr>
-      <w:r>
-        <w:t>Catalog resolution: Look up the normalized name in ToolCatalog. If not found, apply Levenshtein fuzzy matching against known tool names.</w:t>
-      </w:r>
-    </w:p>
-    <w:p>
-      <w:pPr>
-        <w:pStyle w:val="ListNumber"/>
-      </w:pPr>
-      <w:r>
-        <w:t>Schema coercion: If a tool is found, coerce the arguments JSON to match the expected schema (type coercion, default injection, unknown parameter rejection).</w:t>
-      </w:r>
-    </w:p>
-    <w:p>
-      <w:pPr>
-        <w:pStyle w:val="ListNumber"/>
-      </w:pPr>
-      <w:r>
-        <w:t>Validation: Check for required parameters and reject unknown parameters.</w:t>
-      </w:r>
-    </w:p>
-    <w:p>
-      <w:r>
-        <w:rPr>
-          <w:b w:val="0"/>
-          <w:i w:val="0"/>
-          <w:sz w:val="22"/>
-        </w:rPr>
-        <w:t>If repair succeeds, a ToolCallRecord is created with optional repair_metadata. If repair rejects (unknown tool, ambiguous match, missing required params), an error message is injected into the session as a tool result, and the model gets another chance.</w:t>
-      </w:r>
-    </w:p>
-    <w:p>
-      <w:pPr>
-        <w:pStyle w:val="Heading2"/>
-      </w:pPr>
-      <w:r>
-        <w:t>2.5 Compaction Tiers</w:t>
-      </w:r>
-    </w:p>
-    <w:p>
-      <w:r>
-        <w:rPr>
-          <w:b w:val="0"/>
-          <w:i w:val="0"/>
-          <w:sz w:val="22"/>
-        </w:rPr>
-        <w:t>When context pressure (estimated token count / context window) exceeds a threshold, the engine runs compaction. Tiers are tried in order:</w:t>
-      </w:r>
-    </w:p>
-    <w:p>
-      <w:pPr>
-        <w:pStyle w:val="ListBullet"/>
-      </w:pPr>
-      <w:r>
-        <w:t>Micro: Remove recent redundant messages (duplicate user messages, consecutive assistant turns).</w:t>
-      </w:r>
-    </w:p>
-    <w:p>
-      <w:pPr>
-        <w:pStyle w:val="ListBullet"/>
-      </w:pPr>
-      <w:r>
-        <w:t>FIFO: Evict oldest user/assistant pairs, keeping micro_keep_recent pairs intact.</w:t>
-      </w:r>
-    </w:p>
-    <w:p>
-      <w:pPr>
-        <w:pStyle w:val="ListBullet"/>
-      </w:pPr>
-      <w:r>
-        <w:t>ArtifactSquash: Consolidate artifact state (start_artifact + append_blocks) into a single reference.</w:t>
-      </w:r>
-    </w:p>
-    <w:p>
-      <w:pPr>
-        <w:pStyle w:val="ListBullet"/>
-      </w:pPr>
-      <w:r>
-        <w:t>Summary: Ask the host to summarize a message range and replace it with a compact summary message.</w:t>
-      </w:r>
-    </w:p>
-    <w:p>
-      <w:pPr>
-        <w:pStyle w:val="ListBullet"/>
-      </w:pPr>
-      <w:r>
-        <w:t>ToolSpill: Move large tool results (above tool_spill_threshold_bytes) from the message history into ContextStore references.</w:t>
-      </w:r>
-    </w:p>
-    <w:p>
-      <w:pPr>
-        <w:pStyle w:val="ListBullet"/>
-      </w:pPr>
-      <w:r>
-        <w:t>HistorySnapshot: Snapshot the full message range into ContextStore and replace with a reference, keeping only recent context.</w:t>
-      </w:r>
-    </w:p>
-    <w:p>
-      <w:r>
-        <w:rPr>
-          <w:b w:val="0"/>
-          <w:i w:val="0"/>
-          <w:sz w:val="22"/>
-        </w:rPr>
-        <w:t>Compaction can be triggered at four points: Preflight (before a model request), MidTurn (after receiving tool calls from the model), PostToolResult (after executing tools), and Manual (user-initiated).</w:t>
-      </w:r>
-    </w:p>
-    <w:p>
-      <w:pPr>
-        <w:pStyle w:val="Heading2"/>
-      </w:pPr>
-      <w:r>
-        <w:t>2.6 Guardrails</w:t>
-      </w:r>
-    </w:p>
-    <w:p>
-      <w:r>
-        <w:rPr>
-          <w:b w:val="0"/>
-          <w:i w:val="0"/>
-          <w:sz w:val="22"/>
-        </w:rPr>
-        <w:t>The GuardrailState tracks tool call counts and soft-failure streaks per session. Key guardrails:</w:t>
-      </w:r>
-    </w:p>
-    <w:p>
-      <w:pPr>
-        <w:pStyle w:val="ListBullet"/>
-      </w:pPr>
-      <w:r>
-        <w:t>Max turns: When the turn count reaches maxTurns, tool calls are disabled (allow_tool_call=false) but the model is still called for a final text response.</w:t>
-      </w:r>
-    </w:p>
-    <w:p>
-      <w:pPr>
-        <w:pStyle w:val="ListBullet"/>
-      </w:pPr>
-      <w:r>
-        <w:t>Soft-failure streak: When consecutive tool calls result in soft failures, the engine prevents further tool calls after max_streak is reached.</w:t>
-      </w:r>
-    </w:p>
-    <w:p>
-      <w:pPr>
-        <w:pStyle w:val="ListBullet"/>
-      </w:pPr>
-      <w:r>
-        <w:t>Pending work guard: Before finishing, the engine checks for pending work items and can inject a reminder message to force the model to complete outstanding tasks.</w:t>
-      </w:r>
-    </w:p>
-    <w:p>
-      <w:pPr>
-        <w:pStyle w:val="ListBullet"/>
-      </w:pPr>
-      <w:r>
-        <w:t>Artifact auto-finalization: When the model finishes (finish_reason=Stop) but has open artifacts, synthetic finalize_artifact tool calls are generated automatically.</w:t>
-      </w:r>
-    </w:p>
-    <w:p>
-      <w:pPr>
-        <w:pStyle w:val="Heading1"/>
-      </w:pPr>
-      <w:r>
-        <w:t>3. UniFFI Bridge (core/agent)</w:t>
-      </w:r>
-    </w:p>
-    <w:p>
-      <w:pPr>
-        <w:pStyle w:val="Heading2"/>
-      </w:pPr>
-      <w:r>
-        <w:t>3.1 How UniFFI Connects Rust to Kotlin</w:t>
-      </w:r>
-    </w:p>
-    <w:p>
-      <w:r>
-        <w:rPr>
-          <w:b w:val="0"/>
-          <w:i w:val="0"/>
-          <w:sz w:val="22"/>
-        </w:rPr>
-        <w:t>UniFFI is Mozilla's foreign-function interface generator. In this project:</w:t>
-      </w:r>
-    </w:p>
-    <w:p>
-      <w:pPr>
-        <w:pStyle w:val="ListNumber"/>
-      </w:pPr>
-      <w:r>
-        <w:t>Rust structs, enums, and functions are annotated with #[derive(uniffi::Record)], #[derive(uniffi::Enum)], and #[uniffi::export] in the agent_core crate.</w:t>
-      </w:r>
-    </w:p>
-    <w:p>
-      <w:pPr>
-        <w:pStyle w:val="ListNumber"/>
-      </w:pPr>
-      <w:r>
-        <w:t>Running scripts/build-agent-bindings.sh generates a Kotlin file (agent_core.kt) containing type-safe Kotlin representations of every FFI type.</w:t>
-      </w:r>
-    </w:p>
-    <w:p>
-      <w:pPr>
-        <w:pStyle w:val="ListNumber"/>
-      </w:pPr>
-      <w:r>
-        <w:t>The Rust crate is cross-compiled for arm64-v8a (Android) and the resulting libagent_core.so is checked in alongside the generated bindings.</w:t>
-      </w:r>
-    </w:p>
-    <w:p>
-      <w:r>
-        <w:rPr>
-          <w:b/>
-          <w:i w:val="0"/>
-          <w:sz w:val="22"/>
-        </w:rPr>
-        <w:t>The UniFFI boundary transfers these types:</w:t>
-      </w:r>
-    </w:p>
-    <w:p>
-      <w:pPr>
-        <w:pStyle w:val="ListBullet"/>
-      </w:pPr>
-      <w:r>
-        <w:t>FfiAgentAction (enum): CallModel, ExecuteTools, RequestSummary, Finished, Failed, ManualCompactCompleted</w:t>
-      </w:r>
-    </w:p>
-    <w:p>
-      <w:pPr>
-        <w:pStyle w:val="ListBullet"/>
-      </w:pPr>
-      <w:r>
-        <w:t>FfiModelRequest / FfiModelResponse: Structured request/response containing messages, tool calls, finish reasons</w:t>
-      </w:r>
-    </w:p>
-    <w:p>
-      <w:pPr>
-        <w:pStyle w:val="ListBullet"/>
-      </w:pPr>
-      <w:r>
-        <w:t>FfiToolCallRecord / FfiToolResultRecord: Repaired tool calls and their execution results</w:t>
-      </w:r>
-    </w:p>
-    <w:p>
-      <w:pPr>
-        <w:pStyle w:val="ListBullet"/>
-      </w:pPr>
-      <w:r>
-        <w:t>FfiAgentEvent: Telemetry events (TurnStarted, CompactionApplied, ToolRepaired, etc.)</w:t>
-      </w:r>
-    </w:p>
-    <w:p>
-      <w:pPr>
-        <w:pStyle w:val="ListBullet"/>
-      </w:pPr>
-      <w:r>
-        <w:t>FfiAgentConfig / FfiSessionCapabilities: Configuration and capability flags</w:t>
-      </w:r>
-    </w:p>
-    <w:p>
-      <w:pPr>
-        <w:pStyle w:val="ListBullet"/>
-      </w:pPr>
-      <w:r>
-        <w:t>FfiToolParseBatch: Parsed tool call envelopes with repair metadata</w:t>
-      </w:r>
-    </w:p>
-    <w:p>
-      <w:pPr>
-        <w:pStyle w:val="Heading2"/>
-      </w:pPr>
-      <w:r>
-        <w:t>3.2 Kotlin Adapter Classes</w:t>
-      </w:r>
-    </w:p>
-    <w:p>
-      <w:r>
-        <w:rPr>
-          <w:b w:val="0"/>
-          <w:i w:val="0"/>
-          <w:sz w:val="22"/>
-        </w:rPr>
-        <w:t>The core/agent module contains thin Kotlin adapters that wrap the generated UniFFI types and implement domain ports:</w:t>
-      </w:r>
-    </w:p>
-    <w:p>
-      <w:pPr>
-        <w:pStyle w:val="Heading3"/>
-      </w:pPr>
-      <w:r>
-        <w:t>3.2.1 RustAgentEngineAdapter</w:t>
-      </w:r>
-    </w:p>
-    <w:p>
-      <w:r>
-        <w:rPr>
-          <w:b w:val="0"/>
-          <w:i w:val="0"/>
-          <w:sz w:val="22"/>
-        </w:rPr>
-        <w:t>This is the primary orchestrator. It implements AgentLoopPort and drives the submit-style loop with the Rust engine. Key aspects:</w:t>
-      </w:r>
-    </w:p>
-    <w:p>
-      <w:pPr>
-        <w:pStyle w:val="ListBullet"/>
-      </w:pPr>
-      <w:r>
-        <w:t>Creates an FfiAgentEngine via createAgentEngine() with unused callback shims (the submit-style protocol doesn't use UniFFI callbacks).</w:t>
-      </w:r>
-    </w:p>
-    <w:p>
-      <w:pPr>
-        <w:pStyle w:val="ListBullet"/>
-      </w:pPr>
-      <w:r>
-        <w:t>Creates an FfiSession with initial messages, config, capabilities, IO params, and session context JSON.</w:t>
-      </w:r>
-    </w:p>
-    <w:p>
-      <w:pPr>
-        <w:pStyle w:val="ListBullet"/>
-      </w:pPr>
-      <w:r>
-        <w:t>Runs a while(true) loop that calls nextAction(session), drains events, and dispatches to the appropriate host callback on Dispatchers.IO.</w:t>
-      </w:r>
-    </w:p>
-    <w:p>
-      <w:pPr>
-        <w:pStyle w:val="ListBullet"/>
-      </w:pPr>
-      <w:r>
-        <w:t>Maps FfiAgentAction variants to domain AgentLoopEvent emissions via a Kotlin channelFlow.</w:t>
-      </w:r>
-    </w:p>
-    <w:p>
-      <w:pPr>
-        <w:pStyle w:val="ListBullet"/>
-      </w:pPr>
-      <w:r>
-        <w:t>Manages manual compaction requests and context reference read/search.</w:t>
-      </w:r>
-    </w:p>
-    <w:p>
-      <w:pPr>
-        <w:pStyle w:val="ListBullet"/>
-      </w:pPr>
-      <w:r>
-        <w:t>Converts between FfiXxx and domain types using .toFfi() and .toDomain() extension functions.</w:t>
-      </w:r>
-    </w:p>
-    <w:p>
-      <w:pPr>
-        <w:pStyle w:val="Heading3"/>
-      </w:pPr>
-      <w:r>
-        <w:t>3.2.2 RustToolEnvelopeParser</w:t>
-      </w:r>
-    </w:p>
-    <w:p>
-      <w:r>
-        <w:rPr>
-          <w:b w:val="0"/>
-          <w:i w:val="0"/>
-          <w:sz w:val="22"/>
-        </w:rPr>
-        <w:t>Implements ToolEnvelopeParserPort by delegating to the Rust parse_tool_calls() and coerce_provider_arguments() UniFFI free functions. Converts FfiToolParseBatch results to domain ToolEnvelopeBatch types.</w:t>
-      </w:r>
-    </w:p>
-    <w:p>
-      <w:pPr>
-        <w:pStyle w:val="Heading3"/>
-      </w:pPr>
-      <w:r>
-        <w:t>3.2.3 RustToolStreamGate</w:t>
-      </w:r>
-    </w:p>
-    <w:p>
-      <w:r>
-        <w:rPr>
-          <w:b w:val="0"/>
-          <w:i w:val="0"/>
-          <w:sz w:val="22"/>
-        </w:rPr>
-        <w:t>Implements ToolStreamGatePort for streaming tool call detection during model inference. Delegates to the Rust FfiToolStreamGate, which is a stateful streaming parser that buffers text and detects tool-call markers in real time.</w:t>
-      </w:r>
-    </w:p>
-    <w:p>
-      <w:pPr>
-        <w:pStyle w:val="Heading3"/>
-      </w:pPr>
-      <w:r>
-        <w:t>3.2.4 LiteRtAgentPolicyBridge</w:t>
-      </w:r>
-    </w:p>
-    <w:p>
-      <w:r>
-        <w:rPr>
-          <w:b w:val="0"/>
-          <w:i w:val="0"/>
-          <w:sz w:val="22"/>
-        </w:rPr>
-        <w:t>Implements AgentPolicyPort by delegating to Rust policy free functions: repairTool(), truncateResult(), shouldAllowTool(), resultJsonLooksSoftFailure(). These are pure functions that Android code calls for policy decisions without needing a full agent session.</w:t>
-      </w:r>
-    </w:p>
-    <w:p>
-      <w:pPr>
-        <w:pStyle w:val="Heading3"/>
-      </w:pPr>
-      <w:r>
-        <w:t>3.2.5 AgentEventMapper</w:t>
-      </w:r>
-    </w:p>
-    <w:p>
-      <w:r>
-        <w:rPr>
-          <w:b w:val="0"/>
-          <w:i w:val="0"/>
-          <w:sz w:val="22"/>
-        </w:rPr>
-        <w:t>Maps FfiAgentEvent variants to domain AgentLoopEvent types and logs them through the LoggingPort. Some events (ContextPressure, ToolSoftFailure, HookInvoked, ToolPolicyDenied, ToolTimedOut) are logged but not emitted as domain events -- they're informational only.</w:t>
-      </w:r>
-    </w:p>
-    <w:p>
-      <w:pPr>
-        <w:pStyle w:val="Heading1"/>
-      </w:pPr>
-      <w:r>
-        <w:t>4. Kotlin Feature Layer (feature/inference)</w:t>
-      </w:r>
-    </w:p>
-    <w:p>
-      <w:pPr>
-        <w:pStyle w:val="Heading2"/>
-      </w:pPr>
-      <w:r>
-        <w:t>4.1 Inference Services</w:t>
-      </w:r>
-    </w:p>
-    <w:p>
-      <w:r>
-        <w:rPr>
-          <w:b w:val="0"/>
-          <w:i w:val="0"/>
-          <w:sz w:val="22"/>
-        </w:rPr>
-        <w:t>The feature/inference module contains provider-specific inference service implementations that fulfill the model-turn responsibility:</w:t>
-      </w:r>
-    </w:p>
-    <w:p>
-      <w:pPr>
-        <w:pStyle w:val="ListBullet"/>
-      </w:pPr>
-      <w:r>
-        <w:t>LiteRtInferenceServiceImpl: On-device inference via LiteRT/TFLite. Does not support tool calling natively -- uses the Rust envelope parser to extract tool calls from free-form model text.</w:t>
-      </w:r>
-    </w:p>
-    <w:p>
-      <w:pPr>
-        <w:pStyle w:val="ListBullet"/>
-      </w:pPr>
-      <w:r>
-        <w:t>AnthropicInferenceServiceImpl, OpenAiInferenceServiceImpl, GoogleInferenceServiceImpl, XaiInferenceServiceImpl: Cloud BYOK providers. These may use native tool calling (JSON function_call) or envelope parsing depending on provider capabilities.</w:t>
-      </w:r>
-    </w:p>
-    <w:p>
-      <w:pPr>
-        <w:pStyle w:val="ListBullet"/>
-      </w:pPr>
-      <w:r>
-        <w:t>LlamaInferenceServiceImpl: On-device inference via llama.cpp JNI bridge. Similar envelope-parsing approach as LiteRT.</w:t>
-      </w:r>
-    </w:p>
-    <w:p>
-      <w:pPr>
-        <w:pStyle w:val="Heading2"/>
-      </w:pPr>
-      <w:r>
-        <w:t>4.2 The Agent Loop from Kotlin's Perspective</w:t>
-      </w:r>
-    </w:p>
-    <w:p>
-      <w:r>
-        <w:rPr>
-          <w:b w:val="0"/>
-          <w:i w:val="0"/>
-          <w:sz w:val="22"/>
-        </w:rPr>
-        <w:t>When an agent loop starts (e.g., user sends a message), the Kotlin layer:</w:t>
-      </w:r>
-    </w:p>
-    <w:p>
-      <w:pPr>
-        <w:pStyle w:val="ListNumber"/>
-      </w:pPr>
-      <w:r>
-        <w:t>Constructs AgentLoopHostCallbacks -- lambdas for completeModelTurn, executeTools, and summarize.</w:t>
-      </w:r>
-    </w:p>
-    <w:p>
-      <w:pPr>
-        <w:pStyle w:val="ListNumber"/>
-      </w:pPr>
-      <w:r>
-        <w:t>Builds AgentLoopConfig with max turns, compaction thresholds, feature flags, and session IO params (provider name, context window size, tool schemas, system prompt).</w:t>
-      </w:r>
-    </w:p>
-    <w:p>
-      <w:pPr>
-        <w:pStyle w:val="ListNumber"/>
-      </w:pPr>
-      <w:r>
-        <w:t>Passes everything to RustAgentEngineAdapter.execute(), which returns a Flow&lt;AgentLoopEvent&gt;.</w:t>
-      </w:r>
-    </w:p>
-    <w:p>
-      <w:pPr>
-        <w:pStyle w:val="ListNumber"/>
-      </w:pPr>
-      <w:r>
-        <w:t>The adapter enters its while(true) loop driving the Rust engine.</w:t>
-      </w:r>
-    </w:p>
-    <w:p>
-      <w:pPr>
-        <w:pStyle w:val="ListNumber"/>
-      </w:pPr>
-      <w:r>
-        <w:t>For each CallModel action, the adapter calls host.completeModelTurn() which dispatches to the appropriate InferenceService. Streaming tokens are forwarded as AgentLoopEvent.TextToken and AgentLoopEvent.ThinkingToken.</w:t>
-      </w:r>
-    </w:p>
-    <w:p>
-      <w:pPr>
-        <w:pStyle w:val="ListNumber"/>
-      </w:pPr>
-      <w:r>
-        <w:t>For each ExecuteTools action, the adapter calls host.executeTools() which dispatches to registered tool executors (web search, chat history search, artifact management, etc.).</w:t>
-      </w:r>
-    </w:p>
-    <w:p>
-      <w:pPr>
-        <w:pStyle w:val="ListNumber"/>
-      </w:pPr>
-      <w:r>
-        <w:t>For RequestSummary, the adapter calls host.summarize() which uses the same provider to generate a summary of the specified message range.</w:t>
-      </w:r>
-    </w:p>
-    <w:p>
-      <w:pPr>
-        <w:pStyle w:val="ListNumber"/>
-      </w:pPr>
-      <w:r>
-        <w:t>The Flow&lt;AgentLoopEvent&gt; is collected by the UI layer to update the chat screen in real time.</w:t>
-      </w:r>
-    </w:p>
-    <w:p>
-      <w:pPr>
-        <w:pStyle w:val="Heading2"/>
-      </w:pPr>
-      <w:r>
-        <w:t>4.3 Tool Execution Flow</w:t>
-      </w:r>
-    </w:p>
-    <w:p>
-      <w:r>
-        <w:rPr>
-          <w:b w:val="0"/>
-          <w:i w:val="0"/>
-          <w:sz w:val="22"/>
-        </w:rPr>
-        <w:t>When a model returns tool calls, the flow is:</w:t>
-      </w:r>
-    </w:p>
-    <w:p>
-      <w:pPr>
-        <w:pStyle w:val="ListNumber"/>
-      </w:pPr>
-      <w:r>
-        <w:t>The InferenceService returns raw tool call data (either native JSON function_call or extracted envelopes).</w:t>
-      </w:r>
-    </w:p>
-    <w:p>
-      <w:pPr>
-        <w:pStyle w:val="ListNumber"/>
-      </w:pPr>
-      <w:r>
-        <w:t>RustToolEnvelopeParser.parse() runs on the raw output to extract structured ToolEnvelopeField objects if envelope-based parsing is needed.</w:t>
-      </w:r>
-    </w:p>
-    <w:p>
-      <w:pPr>
-        <w:pStyle w:val="ListNumber"/>
-      </w:pPr>
-      <w:r>
-        <w:t>The Rust engine's ToolRepairPipeline runs during submit_model_response, normalizing names and coercing schemas.</w:t>
-      </w:r>
-    </w:p>
-    <w:p>
-      <w:pPr>
-        <w:pStyle w:val="ListNumber"/>
-      </w:pPr>
-      <w:r>
-        <w:t>The engine yields an ExecuteTools action with repaired FfiToolCallRecord objects.</w:t>
-      </w:r>
-    </w:p>
-    <w:p>
-      <w:pPr>
-        <w:pStyle w:val="ListNumber"/>
-      </w:pPr>
-      <w:r>
-        <w:t>Kotlin's RustAgentEngineAdapter maps these to domain AgentToolCall objects and calls host.executeTools().</w:t>
-      </w:r>
-    </w:p>
-    <w:p>
-      <w:pPr>
-        <w:pStyle w:val="ListNumber"/>
-      </w:pPr>
-      <w:r>
-        <w:t>Each tool executor returns an AgentToolResult with resultJson, which is converted back to FfiToolResultRecord and submitted via submitToolResults().</w:t>
-      </w:r>
-    </w:p>
-    <w:p>
-      <w:pPr>
-        <w:pStyle w:val="ListNumber"/>
-      </w:pPr>
-      <w:r>
-        <w:t>The engine processes results (truncation, spilling, compaction) and continues the loop.</w:t>
-      </w:r>
-    </w:p>
-    <w:p>
-      <w:pPr>
-        <w:pStyle w:val="Heading2"/>
-      </w:pPr>
-      <w:r>
-        <w:t>4.4 Streaming and the Tool Stream Gate</w:t>
-      </w:r>
-    </w:p>
-    <w:p>
-      <w:r>
-        <w:rPr>
-          <w:b w:val="0"/>
-          <w:i w:val="0"/>
-          <w:sz w:val="22"/>
-        </w:rPr>
-        <w:t>For providers that stream tokens, the Rust ToolStreamGate provides a stateful parser that processes text chunks incrementally. This allows the UI to show streaming text while simultaneously detecting when a tool-call envelope begins. The stream gate has three operations:</w:t>
-      </w:r>
-    </w:p>
-    <w:p>
-      <w:pPr>
-        <w:pStyle w:val="ListBullet"/>
-      </w:pPr>
-      <w:r>
-        <w:t>push(chunk): Feed text; returns the safe-to-emit text prefix (before any envelope marker).</w:t>
-      </w:r>
-    </w:p>
-    <w:p>
-      <w:pPr>
-        <w:pStyle w:val="ListBullet"/>
-      </w:pPr>
-      <w:r>
-        <w:t>finish(hasNativeToolCalls): Flush remaining buffered text and report whether tool markers were detected.</w:t>
-      </w:r>
-    </w:p>
-    <w:p>
-      <w:pPr>
-        <w:pStyle w:val="ListBullet"/>
-      </w:pPr>
-      <w:r>
-        <w:t>reset(): Reset the gate for a new turn.</w:t>
-      </w:r>
-    </w:p>
-    <w:p>
-      <w:r>
-        <w:rPr>
-          <w:b w:val="0"/>
-          <w:i w:val="0"/>
-          <w:sz w:val="22"/>
-        </w:rPr>
-        <w:t>This ensures that partial tool-call envelopes are never displayed to the user as visible text -- they're held in the gate's buffer until the envelope is complete or confirmed absent.</w:t>
-      </w:r>
-    </w:p>
-    <w:p>
-      <w:pPr>
-        <w:pStyle w:val="Heading1"/>
-      </w:pPr>
-      <w:r>
-        <w:t>5. Complete Lifecycle: A User Message</w:t>
-      </w:r>
-    </w:p>
-    <w:p>
-      <w:r>
-        <w:rPr>
-          <w:b w:val="0"/>
-          <w:i w:val="0"/>
-          <w:sz w:val="22"/>
-        </w:rPr>
-        <w:t>The following is a step-by-step walkthrough of what happens when a user sends a message that triggers tool use:</w:t>
-      </w:r>
-    </w:p>
-    <w:p>
-      <w:pPr>
-        <w:pStyle w:val="ListNumber"/>
-      </w:pPr>
-      <w:r>
-        <w:t>User sends message. ConversationManagerImpl creates initial messages and builds AgentLoopHostCallbacks.</w:t>
-      </w:r>
-    </w:p>
-    <w:p>
-      <w:pPr>
-        <w:pStyle w:val="ListNumber"/>
-      </w:pPr>
-      <w:r>
-        <w:t>RustAgentEngineAdapter.execute() creates an FfiAgentEngine + FfiSession, enters the submit loop.</w:t>
-      </w:r>
-    </w:p>
-    <w:p>
-      <w:pPr>
-        <w:pStyle w:val="ListNumber"/>
-      </w:pPr>
-      <w:r>
-        <w:t>next_action() is called. The engine runs preflight compaction (if context pressure is high), then returns CallModel with session messages, system prompt, tool schema, and context references.</w:t>
-      </w:r>
-    </w:p>
-    <w:p>
-      <w:pPr>
-        <w:pStyle w:val="ListNumber"/>
-      </w:pPr>
-      <w:r>
-        <w:t>Kotlin calls host.completeModelTurn() on Dispatchers.IO. The inference service queries the provider.</w:t>
-      </w:r>
-    </w:p>
-    <w:p>
-      <w:pPr>
-        <w:pStyle w:val="ListNumber"/>
-      </w:pPr>
-      <w:r>
-        <w:t>Model returns text with tool calls. InferenceService extracts them (native or envelope parsing). Returns AgentModelTurnResult with assistantText + toolCalls.</w:t>
-      </w:r>
-    </w:p>
-    <w:p>
-      <w:pPr>
-        <w:pStyle w:val="ListNumber"/>
-      </w:pPr>
-      <w:r>
-        <w:t>Kotlin calls engine.submitModelResponse(). The engine runs envelope parsing (if needed), tool repair (fuzzy name matching, schema coercion), generates repaired/rejected calls.</w:t>
-      </w:r>
-    </w:p>
-    <w:p>
-      <w:pPr>
-        <w:pStyle w:val="ListNumber"/>
-      </w:pPr>
-      <w:r>
-        <w:t>If tool calls survived repair, the engine runs mid-turn compaction, then returns ExecuteTools with the repaired call list.</w:t>
-      </w:r>
-    </w:p>
-    <w:p>
-      <w:pPr>
-        <w:pStyle w:val="ListNumber"/>
-      </w:pPr>
-      <w:r>
-        <w:t>Kotlin calls host.executeTools(). Each tool executor runs (web search, artifact calls, etc.) and returns results.</w:t>
-      </w:r>
-    </w:p>
-    <w:p>
-      <w:pPr>
-        <w:pStyle w:val="ListNumber"/>
-      </w:pPr>
-      <w:r>
-        <w:t>Kotlin calls engine.submitToolResults(). The engine processes results (truncation, spilling, soft-failure detection), runs post-tool-result compaction.</w:t>
-      </w:r>
-    </w:p>
-    <w:p>
-      <w:pPr>
-        <w:pStyle w:val="ListNumber"/>
-      </w:pPr>
-      <w:r>
-        <w:t>Engine returns CallModel again (with tool results now in the session history). Loop continues.</w:t>
-      </w:r>
-    </w:p>
-    <w:p>
-      <w:pPr>
-        <w:pStyle w:val="ListNumber"/>
-      </w:pPr>
-      <w:r>
-        <w:t>When the model returns with no tool calls and finish_reason=Stop, the engine checks for pending artifact finalization, then returns Finished.</w:t>
-      </w:r>
-    </w:p>
-    <w:p>
-      <w:pPr>
-        <w:pStyle w:val="ListNumber"/>
-      </w:pPr>
-      <w:r>
-        <w:t>RustAgentEngineAdapter emits AgentLoopEvent.Finished. Loop ends, UI shows final response.</w:t>
-      </w:r>
-    </w:p>
-    <w:p>
-      <w:pPr>
-        <w:pStyle w:val="Heading1"/>
-      </w:pPr>
-      <w:r>
-        <w:t>6. Compaction in Detail</w:t>
-      </w:r>
-    </w:p>
-    <w:p>
-      <w:pPr>
-        <w:pStyle w:val="Heading2"/>
-      </w:pPr>
-      <w:r>
-        <w:t>6.1 Token Pressure Estimation</w:t>
-      </w:r>
-    </w:p>
-    <w:p>
-      <w:r>
-        <w:rPr>
-          <w:b w:val="0"/>
-          <w:i w:val="0"/>
-          <w:sz w:val="22"/>
-        </w:rPr>
-        <w:t>The TokenLedger estimates total token usage by counting characters in all session messages, system prompt, and tool schemas, divided by a provider-specific ratio. This estimate is compared against context_window_tokens (from SessionIoParams) multiplied by the threshold_ratio from AgentConfig.</w:t>
-      </w:r>
-    </w:p>
-    <w:p>
-      <w:pPr>
-        <w:pStyle w:val="Heading2"/>
-      </w:pPr>
-      <w:r>
-        <w:t>6.2 ContextStore</w:t>
-      </w:r>
-    </w:p>
-    <w:p>
-      <w:r>
-        <w:rPr>
-          <w:b w:val="0"/>
-          <w:i w:val="0"/>
-          <w:sz w:val="22"/>
-        </w:rPr>
-        <w:t>The ContextStore is a virtual overlay that keeps large content out of the message history. Instead of stuffing huge tool results into the chat, the engine spills them to the context store and replaces them with a reference marker. Types of context references:</w:t>
-      </w:r>
-    </w:p>
-    <w:p>
-      <w:pPr>
-        <w:pStyle w:val="ListBullet"/>
-      </w:pPr>
-      <w:r>
-        <w:t>ToolOutput: Large tool results that exceeded spill thresholds</w:t>
-      </w:r>
-    </w:p>
-    <w:p>
-      <w:pPr>
-        <w:pStyle w:val="ListBullet"/>
-      </w:pPr>
-      <w:r>
-        <w:t>TerminalOutput: Terminal command output stored verbatim</w:t>
-      </w:r>
-    </w:p>
-    <w:p>
-      <w:pPr>
-        <w:pStyle w:val="ListBullet"/>
-      </w:pPr>
-      <w:r>
-        <w:t>HistorySnapshot: Snapshotted message ranges for summary compaction</w:t>
-      </w:r>
-    </w:p>
-    <w:p>
-      <w:pPr>
-        <w:pStyle w:val="ListBullet"/>
-      </w:pPr>
-      <w:r>
-        <w:t>ArtifactSnapshot: Artifact state at a point in time</w:t>
-      </w:r>
-    </w:p>
-    <w:p>
-      <w:pPr>
-        <w:pStyle w:val="ListBullet"/>
-      </w:pPr>
-      <w:r>
-        <w:t>FileOutline / FileChunk: Condensed file context for large documents</w:t>
-      </w:r>
-    </w:p>
-    <w:p>
-      <w:pPr>
-        <w:pStyle w:val="ListBullet"/>
-      </w:pPr>
-      <w:r>
-        <w:t>ToolSchema / ToolCatalogIndex: Tool schema deferral for small context models</w:t>
-      </w:r>
-    </w:p>
-    <w:p>
-      <w:pPr>
-        <w:pStyle w:val="Heading2"/>
-      </w:pPr>
-      <w:r>
-        <w:t>6.3 StateLedger</w:t>
-      </w:r>
-    </w:p>
-    <w:p>
-      <w:r>
-        <w:rPr>
-          <w:b w:val="0"/>
-          <w:i w:val="0"/>
-          <w:sz w:val="22"/>
-        </w:rPr>
-        <w:t>The StateLedger observes user and assistant messages and builds an "anchor message" -- a synthetic system message injected at the top of the session that summarizes known state (what files are open, what artifacts exist, what work is pending). This gives the model a compressed view of context without replaying the entire history.</w:t>
-      </w:r>
-    </w:p>
-    <w:p>
-      <w:pPr>
-        <w:pStyle w:val="Heading1"/>
-      </w:pPr>
-      <w:r>
-        <w:t>7. Standalone Policy Functions</w:t>
-      </w:r>
-    </w:p>
-    <w:p>
-      <w:r>
-        <w:rPr>
-          <w:b w:val="0"/>
-          <w:i w:val="0"/>
-          <w:sz w:val="22"/>
-        </w:rPr>
-        <w:t>In addition to the session engine, agent_core exports several standalone policy functions that Android code can call without creating a session:</w:t>
-      </w:r>
-    </w:p>
-    <w:p>
-      <w:pPr>
-        <w:pStyle w:val="ListBullet"/>
-      </w:pPr>
-      <w:r>
-        <w:t>repairTool(name, argsJson): Fuzzy-name repair and schema coercion for a single tool call.</w:t>
-      </w:r>
-    </w:p>
-    <w:p>
-      <w:pPr>
-        <w:pStyle w:val="ListBullet"/>
-      </w:pPr>
-      <w:r>
-        <w:t>truncateResult(json, budgetBytes): Truncate a tool result JSON to fit within a byte budget.</w:t>
-      </w:r>
-    </w:p>
-    <w:p>
-      <w:pPr>
-        <w:pStyle w:val="ListBullet"/>
-      </w:pPr>
-      <w:r>
-        <w:t>shouldAllowTool(softFailureStreak, maxStreak): Guardrail check for whether tool calls should be allowed.</w:t>
-      </w:r>
-    </w:p>
-    <w:p>
-      <w:pPr>
-        <w:pStyle w:val="ListBullet"/>
-      </w:pPr>
-      <w:r>
-        <w:t>resultJsonLooksSoftFailure(json): Heuristic check for soft-failure patterns in tool result JSON.</w:t>
-      </w:r>
-    </w:p>
-    <w:p>
-      <w:pPr>
-        <w:pStyle w:val="ListBullet"/>
-      </w:pPr>
-      <w:r>
-        <w:t>parseToolCalls(raw): Full envelope parsing pipeline (normalize, extract, repair, coerce, validate).</w:t>
-      </w:r>
-    </w:p>
-    <w:p>
-      <w:pPr>
-        <w:pStyle w:val="ListBullet"/>
-      </w:pPr>
-      <w:r>
-        <w:t>coerceProviderArguments(toolName, argsJson): Run only the coercion step on already-parsed tool arguments.</w:t>
-      </w:r>
-    </w:p>
-    <w:p>
-      <w:pPr>
-        <w:pStyle w:val="ListBullet"/>
-      </w:pPr>
-      <w:r>
-        <w:t>hasLocalToolContract(systemPrompt): Check whether a system prompt contains local tool markers.</w:t>
-      </w:r>
-    </w:p>
-    <w:p>
-      <w:pPr>
-        <w:pStyle w:val="ListBullet"/>
-      </w:pPr>
-      <w:r>
-        <w:t>createToolStreamGate(allowToolCall): Create a streaming parser instance for incremental tool-call detection.</w:t>
-      </w:r>
-    </w:p>
-    <w:p>
-      <w:pPr>
-        <w:pStyle w:val="Heading1"/>
-      </w:pPr>
-      <w:r>
-        <w:t>8. Key Configuration (AgentConfig)</w:t>
-      </w:r>
-    </w:p>
-    <w:p>
-      <w:r>
-        <w:rPr>
-          <w:b w:val="0"/>
-          <w:i w:val="0"/>
-          <w:sz w:val="22"/>
-        </w:rPr>
-        <w:t>The FfiAgentConfig / AgentConfig struct controls engine behavior:</w:t>
-      </w:r>
-    </w:p>
-    <w:p>
-      <w:pPr>
-        <w:pStyle w:val="ListBullet"/>
-      </w:pPr>
-      <w:r>
-        <w:t>maxTurns: Maximum tool-use turns before disabling tool calls (default varies by provider).</w:t>
-      </w:r>
-    </w:p>
-    <w:p>
-      <w:pPr>
-        <w:pStyle w:val="ListBullet"/>
-      </w:pPr>
-      <w:r>
-        <w:t>thresholdRatio / midTurnThresholdRatio / postToolResultThresholdRatio: Context pressure ratios that trigger compaction at different phases.</w:t>
-      </w:r>
-    </w:p>
-    <w:p>
-      <w:pPr>
-        <w:pStyle w:val="ListBullet"/>
-      </w:pPr>
-      <w:r>
-        <w:t>microKeepRecent: How many recent messages to protect from first-in-first-out eviction.</w:t>
-      </w:r>
-    </w:p>
-    <w:p>
-      <w:pPr>
-        <w:pStyle w:val="ListBullet"/>
-      </w:pPr>
-      <w:r>
-        <w:t>toolRetryLimit: Maximum consecutive soft-failure turns before disabling tools.</w:t>
-      </w:r>
-    </w:p>
-    <w:p>
-      <w:pPr>
-        <w:pStyle w:val="ListBullet"/>
-      </w:pPr>
-      <w:r>
-        <w:t>toolSpillThresholdBytes / terminalSpillThresholdBytes: Byte thresholds above which tool results are moved to ContextStore.</w:t>
-      </w:r>
-    </w:p>
-    <w:p>
-      <w:pPr>
-        <w:pStyle w:val="ListBullet"/>
-      </w:pPr>
-      <w:r>
-        <w:t>enableContextStore / enableStateLedger / enableToolSchemaDeferral / enableFileCondensation: Feature flags for context management.</w:t>
-      </w:r>
-    </w:p>
-    <w:p>
-      <w:pPr>
-        <w:pStyle w:val="ListBullet"/>
-      </w:pPr>
-      <w:r>
-        <w:t>enableManualCompact: Allow user-triggered compaction from the UI.</w:t>
-      </w:r>
-    </w:p>
-    <w:p>
-      <w:pPr>
-        <w:pStyle w:val="ListBullet"/>
-      </w:pPr>
-      <w:r>
-        <w:t>enableLoopHooks / enablePendingWorkGuard: Lifecycle hooks and doom-loop prevention.</w:t>
-      </w:r>
-    </w:p>
-    <w:p>
-      <w:pPr>
-        <w:pStyle w:val="Heading1"/>
-      </w:pPr>
-      <w:r>
-        <w:t>9. Error Handling and Self-Healing</w:t>
-      </w:r>
-    </w:p>
-    <w:p>
-      <w:r>
-        <w:rPr>
-          <w:b w:val="0"/>
-          <w:i w:val="0"/>
-          <w:sz w:val="22"/>
-        </w:rPr>
-        <w:t>The engine has multiple self-healing mechanisms:</w:t>
-      </w:r>
-    </w:p>
-    <w:p>
-      <w:pPr>
-        <w:pStyle w:val="ListBullet"/>
-      </w:pPr>
-      <w:r>
-        <w:t>Tool name repair: Fuzzy matching corrects misspelled tool names (e.g., "web_seach" becomes "web_search").</w:t>
-      </w:r>
-    </w:p>
-    <w:p>
-      <w:pPr>
-        <w:pStyle w:val="ListBullet"/>
-      </w:pPr>
-      <w:r>
-        <w:t>Envelope parse failure recovery: If the model outputs malformed tool envelopes, the engine injects error messages and lets the model try again rather than crashing.</w:t>
-      </w:r>
-    </w:p>
-    <w:p>
-      <w:pPr>
-        <w:pStyle w:val="ListBullet"/>
-      </w:pPr>
-      <w:r>
-        <w:t>Soft-failure detection: Tool results that indicate recoverable errors (rate limits, transient failures) are tracked as soft failures. If too many accumulate, tool calls are disabled gracefully.</w:t>
-      </w:r>
-    </w:p>
-    <w:p>
-      <w:pPr>
-        <w:pStyle w:val="ListBullet"/>
-      </w:pPr>
-      <w:r>
-        <w:t>Compaction fallbacks: If the preferred compaction tier isn't available (e.g., summarization not allowed), the engine tries less aggressive tiers. If no tier reduces context enough, it fails with a CompactionFailed error.</w:t>
-      </w:r>
-    </w:p>
-    <w:p>
-      <w:pPr>
-        <w:pStyle w:val="ListBullet"/>
-      </w:pPr>
-      <w:r>
-        <w:t>Artifact auto-finalization: When the model finishes with open artifacts, synthetic finalize calls are generated automatically to ensure artifacts are properly closed.</w:t>
-      </w:r>
-    </w:p>
-    <w:p>
-      <w:pPr>
-        <w:pStyle w:val="Heading1"/>
-      </w:pPr>
-      <w:r>
-        <w:t>10. Threading Model</w:t>
-      </w:r>
-    </w:p>
-    <w:p>
-      <w:r>
-        <w:rPr>
-          <w:b w:val="0"/>
-          <w:i w:val="0"/>
-          <w:sz w:val="22"/>
-        </w:rPr>
-        <w:t>Rust calls Kotlin callbacks on the caller thread (often a JNI worker). Heavy work must use Dispatchers.IO. RustAgentEngineAdapter explicitly dispatches host suspend callbacks onto Dispatchers.IO via withContext(Dispatchers.IO) before invoking model, tool, or summary work.</w:t>
-      </w:r>
-    </w:p>
-    <w:p>
-      <w:r>
-        <w:rPr>
-          <w:b w:val="0"/>
-          <w:i w:val="0"/>
-          <w:sz w:val="22"/>
-        </w:rPr>
-        <w:t>The Rust engine itself is thread-safe: SessionHandle uses a Mutex&lt;InnerSession&gt; so next_action(), submit_model_response(), and other mutations are serialized. The Kotlin adapter maintains activeEngine, activeSession, and activeHost references that are cleared in the finally block of the channelFlow.</w:t>
-      </w:r>
-    </w:p>
-    <w:p>
-      <w:pPr>
-        <w:pStyle w:val="Heading1"/>
-      </w:pPr>
-      <w:r>
-        <w:t>11. Binding Regeneration</w:t>
-      </w:r>
-    </w:p>
-    <w:p>
-      <w:r>
-        <w:rPr>
-          <w:b w:val="0"/>
-          <w:i w:val="0"/>
-          <w:sz w:val="22"/>
-        </w:rPr>
-        <w:t>When the Rust FFI surface changes:</w:t>
-      </w:r>
-    </w:p>
-    <w:p>
-      <w:pPr>
-        <w:pStyle w:val="ListNumber"/>
-      </w:pPr>
-      <w:r>
-        <w:t>Modify Rust types/functions in third_party/agent_core/src/ffi/.</w:t>
-      </w:r>
-    </w:p>
-    <w:p>
-      <w:pPr>
-        <w:pStyle w:val="ListNumber"/>
-      </w:pPr>
-      <w:r>
-        <w:t>Bump the version in third_party/agent_core/Cargo.toml (semver).</w:t>
-      </w:r>
-    </w:p>
-    <w:p>
-      <w:pPr>
-        <w:pStyle w:val="ListNumber"/>
-      </w:pPr>
-      <w:r>
-        <w:t>Run scripts/build-agent-bindings.sh to regenerate agent_core.kt and libagent_core.so.</w:t>
-      </w:r>
-    </w:p>
-    <w:p>
-      <w:pPr>
-        <w:pStyle w:val="ListNumber"/>
-      </w:pPr>
-      <w:r>
-        <w:t>Commit the Rust source, generated bindings, and native libraries together.</w:t>
-      </w:r>
-    </w:p>
-    <w:p>
-      <w:pPr>
-        <w:pStyle w:val="ListNumber"/>
-      </w:pPr>
-      <w:r>
-        <w:t>Run cargo test in third_party/agent_core and ./gradlew :core:agent:assembleDebug for verification.</w:t>
-      </w:r>
-    </w:p>
-    <w:p>
-      <w:pPr>
-        <w:pStyle w:val="Heading1"/>
-      </w:pPr>
-      <w:r>
-        <w:t>12. Visual Summary: Data Flow</w:t>
-      </w:r>
-    </w:p>
-    <w:p>
-      <w:r>
-        <w:rPr>
-          <w:b/>
-          <w:i w:val="0"/>
-          <w:sz w:val="22"/>
-        </w:rPr>
-        <w:t>The following text diagram shows the core data flow through the system:</w:t>
-      </w:r>
-    </w:p>
-    <w:p>
-      <w:r>
-        <w:rPr>
-          <w:rFonts w:ascii="Consolas" w:hAnsi="Consolas"/>
-          <w:sz w:val="18"/>
-        </w:rPr>
-        <w:t>User Message</w:t>
-        <w:br/>
-        <w:t xml:space="preserve">     |</w:t>
-        <w:br/>
-        <w:t xml:space="preserve">     v</w:t>
-        <w:br/>
-        <w:t>ConversationManagerImpl</w:t>
-        <w:br/>
-        <w:t xml:space="preserve">     |  constructs AgentLoopConfig + AgentLoopHostCallbacks</w:t>
-        <w:br/>
-        <w:t xml:space="preserve">     v</w:t>
-        <w:br/>
-        <w:t>RustAgentEngineAdapter.execute()</w:t>
-        <w:br/>
-        <w:t xml:space="preserve">     |  creates FfiAgentEngine + FfiSession</w:t>
-        <w:br/>
-        <w:t xml:space="preserve">     |  enters while(true) loop</w:t>
-        <w:br/>
-        <w:t xml:space="preserve">     v</w:t>
-        <w:br/>
-        <w:t>+--- FfiAgentEngine.next_action() --------------------------------+</w:t>
-        <w:br/>
-        <w:t>|                                                                    |</w:t>
-        <w:br/>
-        <w:t>|  +-- Idle -----------------------------------------------------+  |</w:t>
-        <w:br/>
-        <w:t>|  |  Run preflight compaction (if needed)                      |  |</w:t>
-        <w:br/>
-        <w:t>|  |  Build ModelRequest (messages + system + tools + context)  |  |</w:t>
-        <w:br/>
-        <w:t>|  |  -&gt; Return CallModel                                        |  |</w:t>
-        <w:br/>
-        <w:t>|  +-------------------------------------------------------------+  |</w:t>
-        <w:br/>
-        <w:t>|                                                                    |</w:t>
-        <w:br/>
-        <w:t>|  +-- AwaitingModel --------------------------------------------+  |</w:t>
-        <w:br/>
-        <w:t>|  |  Return pending CallModel request                           |  |</w:t>
-        <w:br/>
-        <w:t>|  +-------------------------------------------------------------+  |</w:t>
-        <w:br/>
-        <w:t>|                                                                    |</w:t>
-        <w:br/>
-        <w:t>|  Kotlin calls host.completeModelTurn() on Dispatchers.IO          |</w:t>
-        <w:br/>
-        <w:t>|  Then calls engine.submit_model_response(response)                 |</w:t>
-        <w:br/>
-        <w:t>|                                                                    |</w:t>
-        <w:br/>
-        <w:t>|  +-- Processing Model Response --------------------------------+   |</w:t>
-        <w:br/>
-        <w:t>|  |  1. Envelope parsing (extract tool calls from text)        |   |</w:t>
-        <w:br/>
-        <w:t>|  |  2. Tool repair (name normalization, schema coercion)      |   |</w:t>
-        <w:br/>
-        <w:t>|  |  3. Guardrail checks (max turns, soft failures)             |   |</w:t>
-        <w:br/>
-        <w:t>|  |  4. Mid-turn compaction (if needed)                         |   |</w:t>
-        <w:br/>
-        <w:t>|  |  5. -&gt; Return ExecuteTools or Finished                      |   |</w:t>
-        <w:br/>
-        <w:t>|  +-------------------------------------------------------------+   |</w:t>
-        <w:br/>
-        <w:t>|                                                                    |</w:t>
-        <w:br/>
-        <w:t>|  +-- AwaitingTools --------------------------------------------+  |</w:t>
-        <w:br/>
-        <w:t>|  |  Return pending tool call list                              |  |</w:t>
-        <w:br/>
-        <w:t>|  +-------------------------------------------------------------+  |</w:t>
-        <w:br/>
-        <w:t>|                                                                    |</w:t>
-        <w:br/>
-        <w:t>|  Kotlin calls host.execute_tools() on Dispatchers.IO               |</w:t>
-        <w:br/>
-        <w:t>|  Then calls engine.submit_tool_results(results)                     |</w:t>
-        <w:br/>
-        <w:t>|                                                                    |</w:t>
-        <w:br/>
-        <w:t>|  +-- Processing Tool Results ----------------------------------+   |</w:t>
-        <w:br/>
-        <w:t>|  |  1. Tool result truncation (budget enforcement)             |   |</w:t>
-        <w:br/>
-        <w:t>|  |  2. Context spilling (large results -&gt; ContextStore)        |   |</w:t>
-        <w:br/>
-        <w:t>|  |  3. Post-tool-result compaction (if needed)                  |   |</w:t>
-        <w:br/>
-        <w:t>|  |  4. Artifact finalization (if model finished)                |   |</w:t>
-        <w:br/>
-        <w:t>|  |  5. -&gt; Return CallModel (continue) or Finished (done)        |   |</w:t>
-        <w:br/>
-        <w:t>|  +-------------------------------------------------------------+   |</w:t>
-        <w:br/>
-        <w:t>|                                                                    |</w:t>
-        <w:br/>
-        <w:t>|  +-- AwaitingSummary ------------------------------------------+  |</w:t>
-        <w:br/>
-        <w:t>|  |  Return pending summary request                             |  |</w:t>
-        <w:br/>
-        <w:t>|  +-------------------------------------------------------------+  |</w:t>
-        <w:br/>
-        <w:t>|                                                                    |</w:t>
-        <w:br/>
-        <w:t>|  Kotlin calls host.summarize() on Dispatchers.IO                   |</w:t>
-        <w:br/>
-        <w:t>|  Then calls engine.submit_summary(result)                            |</w:t>
-        <w:br/>
-        <w:t>|                                                                    |</w:t>
-        <w:br/>
-        <w:t>|  -&gt; Back to Idle (loop continues)                                  |</w:t>
-        <w:br/>
-        <w:t>|                                                                    |</w:t>
-        <w:br/>
-        <w:t>|  +-- Finished / Failed -----------------------------------------+ |</w:t>
-        <w:br/>
-        <w:t>|  |  Session complete, exit loop                                |  |</w:t>
-        <w:br/>
-        <w:t>|  +-------------------------------------------------------------+  |</w:t>
-        <w:br/>
-        <w:t>|                                                                    |</w:t>
-        <w:br/>
-        <w:t>+--------------------------------------------------------------------+</w:t>
-        <w:br/>
-        <w:br/>
-        <w:t>drain_events() is called after each action to collect:</w:t>
-        <w:br/>
-        <w:t xml:space="preserve">  TurnStarted, TurnCompleted, CompactionApplied, ToolRepaired,</w:t>
-        <w:br/>
-        <w:t xml:space="preserve">  KvCacheInvalidated, PreCompact, PostCompact, ContextPressure, etc.</w:t>
-      </w:r>
-    </w:p>
-    <w:p>
-      <w:pPr>
-        <w:pStyle w:val="Heading1"/>
-      </w:pPr>
-      <w:r>
-        <w:t>13. Module Map</w:t>
-      </w:r>
-    </w:p>
-    <w:p>
-      <w:r>
-        <w:rPr>
-          <w:b/>
-          <w:i w:val="0"/>
-          <w:sz w:val="22"/>
-        </w:rPr>
-        <w:t>Rust Modules (third_party/agent_core/src/):</w:t>
-      </w:r>
-    </w:p>
-    <w:p>
-      <w:pPr>
-        <w:pStyle w:val="ListBullet"/>
-      </w:pPr>
-      <w:r>
-        <w:t>action.rs -- AgentAction enum (CallModel, ExecuteTools, RequestSummary, Finished, Failed)</w:t>
-      </w:r>
-    </w:p>
-    <w:p>
-      <w:pPr>
-        <w:pStyle w:val="ListBullet"/>
-      </w:pPr>
-      <w:r>
-        <w:t>engine/mod.rs -- AgentEngine state machine, session lifecycle, submit-style API</w:t>
-      </w:r>
-    </w:p>
-    <w:p>
-      <w:pPr>
-        <w:pStyle w:val="ListBullet"/>
-      </w:pPr>
-      <w:r>
-        <w:t>engine/state.rs -- InnerSession, EnginePhase, SessionHandle</w:t>
-      </w:r>
-    </w:p>
-    <w:p>
-      <w:pPr>
-        <w:pStyle w:val="ListBullet"/>
-      </w:pPr>
-      <w:r>
-        <w:t>host.rs -- AgentTransport, AgentToolExecutor, AgentSummarizer trait definitions</w:t>
-      </w:r>
-    </w:p>
-    <w:p>
-      <w:pPr>
-        <w:pStyle w:val="ListBullet"/>
-      </w:pPr>
-      <w:r>
-        <w:t>tool_parse/ -- Envelope parsing (XML, JSON, DSML, CDATA, Mistral, GLM formats)</w:t>
-      </w:r>
-    </w:p>
-    <w:p>
-      <w:pPr>
-        <w:pStyle w:val="ListBullet"/>
-      </w:pPr>
-      <w:r>
-        <w:t>repair/ -- ToolRepairPipeline: name normalization, fuzzy matching, schema coercion</w:t>
-      </w:r>
-    </w:p>
-    <w:p>
-      <w:pPr>
-        <w:pStyle w:val="ListBullet"/>
-      </w:pPr>
-      <w:r>
-        <w:t>catalog.rs -- ToolCatalog: global registry of known tool names and schema hints</w:t>
-      </w:r>
-    </w:p>
-    <w:p>
-      <w:pPr>
-        <w:pStyle w:val="ListBullet"/>
-      </w:pPr>
-      <w:r>
-        <w:t>compact/ -- Compaction tiers: micro, fifo, artifact_squash, summary, tool_spill, history_snapshot</w:t>
-      </w:r>
-    </w:p>
-    <w:p>
-      <w:pPr>
-        <w:pStyle w:val="ListBullet"/>
-      </w:pPr>
-      <w:r>
-        <w:t>guardrails.rs -- GuardrailState: turn limits, soft-failure tracking, tool policy</w:t>
-      </w:r>
-    </w:p>
-    <w:p>
-      <w:pPr>
-        <w:pStyle w:val="ListBullet"/>
-      </w:pPr>
-      <w:r>
-        <w:t>budget.rs -- TokenLedger: token estimation and context pressure calculation</w:t>
-      </w:r>
-    </w:p>
-    <w:p>
-      <w:pPr>
-        <w:pStyle w:val="ListBullet"/>
-      </w:pPr>
-      <w:r>
-        <w:t>context_store.rs -- ContextStore: virtual context references for large content</w:t>
-      </w:r>
-    </w:p>
-    <w:p>
-      <w:pPr>
-        <w:pStyle w:val="ListBullet"/>
-      </w:pPr>
-      <w:r>
-        <w:t>state_ledger.rs -- StateLedger: state anchor construction from message history</w:t>
-      </w:r>
-    </w:p>
-    <w:p>
-      <w:pPr>
-        <w:pStyle w:val="ListBullet"/>
-      </w:pPr>
-      <w:r>
-        <w:t>session.rs -- AgentSession, AgentConfig, SessionCapabilities</w:t>
-      </w:r>
-    </w:p>
-    <w:p>
-      <w:pPr>
-        <w:pStyle w:val="ListBullet"/>
-      </w:pPr>
-      <w:r>
-        <w:t>message.rs -- AgentMessage, AgentRole, ToolCallRecord, ToolResultRecord</w:t>
-      </w:r>
-    </w:p>
-    <w:p>
-      <w:pPr>
-        <w:pStyle w:val="ListBullet"/>
-      </w:pPr>
-      <w:r>
-        <w:t>turn_io.rs -- ModelRequest, ModelResponse, RawToolCall, FinishReason, SummaryRequest/Result</w:t>
-      </w:r>
-    </w:p>
-    <w:p>
-      <w:pPr>
-        <w:pStyle w:val="ListBullet"/>
-      </w:pPr>
-      <w:r>
-        <w:t>events.rs -- AgentEvent enum, CompactionTrigger, CompactionTier, AgentError</w:t>
-      </w:r>
-    </w:p>
-    <w:p>
-      <w:pPr>
-        <w:pStyle w:val="ListBullet"/>
-      </w:pPr>
-      <w:r>
-        <w:t>ffi/ -- UniFFI adapter layer (types, callbacks, policy_bridge, stream_gate)</w:t>
-      </w:r>
-    </w:p>
-    <w:p>
-      <w:pPr>
-        <w:pStyle w:val="ListBullet"/>
-      </w:pPr>
-      <w:r>
-        <w:t>tool_stream_gate/ -- Streaming tool-call detection for token-by-token parsing</w:t>
-      </w:r>
-    </w:p>
-    <w:p>
-      <w:pPr>
-        <w:pStyle w:val="ListBullet"/>
-      </w:pPr>
-      <w:r>
-        <w:t>truncate.rs -- Tool result JSON truncation</w:t>
-      </w:r>
-    </w:p>
-    <w:p>
-      <w:pPr>
-        <w:pStyle w:val="ListBullet"/>
-      </w:pPr>
-      <w:r>
-        <w:t>manual_compact.rs -- User-initiated compaction flow</w:t>
-      </w:r>
-    </w:p>
-    <w:p>
-      <w:pPr>
-        <w:pStyle w:val="ListBullet"/>
-      </w:pPr>
-      <w:r>
-        <w:t>artifact_finalize.rs -- Auto-finalization of open artifacts on session end</w:t>
-      </w:r>
-    </w:p>
-    <w:p>
-      <w:pPr>
-        <w:pStyle w:val="ListBullet"/>
-      </w:pPr>
-      <w:r>
-        <w:t>request_pipeline.rs -- Runtime tool catalog rendering and context preparation</w:t>
-      </w:r>
-    </w:p>
-    <w:p>
-      <w:r>
-        <w:rPr>
-          <w:b/>
-          <w:i w:val="0"/>
-          <w:sz w:val="22"/>
-        </w:rPr>
-        <w:t>Kotlin Modules (core/agent/src/main/kotlin/):</w:t>
-      </w:r>
-    </w:p>
-    <w:p>
-      <w:pPr>
-        <w:pStyle w:val="ListBullet"/>
-      </w:pPr>
-      <w:r>
-        <w:t>RustAgentEngineAdapter.kt -- Primary orchestrator implementing AgentLoopPort, drives the submit-style loop</w:t>
-      </w:r>
-    </w:p>
-    <w:p>
-      <w:pPr>
-        <w:pStyle w:val="ListBullet"/>
-      </w:pPr>
-      <w:r>
-        <w:t>AgentEngineActionDriver.kt -- Alternative driver that processes a flat list of actions (used for test replay)</w:t>
-      </w:r>
-    </w:p>
-    <w:p>
-      <w:pPr>
-        <w:pStyle w:val="ListBullet"/>
-      </w:pPr>
-      <w:r>
-        <w:t>AgentEventMapper.kt -- Maps FfiAgentEvent to domain AgentLoopEvent, logs telemetry</w:t>
-      </w:r>
-    </w:p>
-    <w:p>
-      <w:pPr>
-        <w:pStyle w:val="ListBullet"/>
-      </w:pPr>
-      <w:r>
-        <w:t>RustToolEnvelopeParser.kt -- ToolEnvelopeParserPort implementation delegating to Rust parse_tool_calls()</w:t>
-      </w:r>
-    </w:p>
-    <w:p>
-      <w:pPr>
-        <w:pStyle w:val="ListBullet"/>
-      </w:pPr>
-      <w:r>
-        <w:t>RustToolStreamGate.kt -- ToolStreamGatePort implementation for streaming tool detection</w:t>
-      </w:r>
-    </w:p>
-    <w:p>
-      <w:pPr>
-        <w:pStyle w:val="ListBullet"/>
-      </w:pPr>
-      <w:r>
-        <w:t>LiteRtAgentPolicyBridge.kt -- AgentPolicyPort implementation delegating to Rust repair/truncate/shouldAllow functions</w:t>
-      </w:r>
-    </w:p>
-    <w:p>
-      <w:pPr>
-        <w:pStyle w:val="ListBullet"/>
-      </w:pPr>
-      <w:r>
-        <w:t>AgentModule.kt -- Hilt DI module that wires up agent module dependencies</w:t>
-      </w:r>
-    </w:p>
-    <w:p>
-      <w:r>
-        <w:rPr>
-          <w:b/>
-          <w:i w:val="0"/>
-          <w:sz w:val="22"/>
-        </w:rPr>
-        <w:t>Kotlin Modules (feature/inference/src/main/kotlin/):</w:t>
-      </w:r>
-    </w:p>
-    <w:p>
-      <w:pPr>
-        <w:pStyle w:val="ListBullet"/>
-      </w:pPr>
-      <w:r>
-        <w:t>ConversationManagerImpl.kt -- Manages chat sessions, wires up inference services and the agent loop</w:t>
-      </w:r>
-    </w:p>
-    <w:p>
-      <w:pPr>
-        <w:pStyle w:val="ListBullet"/>
-      </w:pPr>
-      <w:r>
-        <w:t>RustLoopInferenceService.kt -- InferenceService that delegates to RustAgentEngineAdapter for the full agent loop</w:t>
-      </w:r>
-    </w:p>
-    <w:p>
-      <w:pPr>
-        <w:pStyle w:val="ListBullet"/>
-      </w:pPr>
-      <w:r>
-        <w:t>LiteRtInferenceServiceImpl.kt -- On-device inference via LiteRT (Gemma, etc.)</w:t>
-      </w:r>
-    </w:p>
-    <w:p>
-      <w:pPr>
-        <w:pStyle w:val="ListBullet"/>
-      </w:pPr>
-      <w:r>
-        <w:t>LlamaInferenceServiceImpl.kt -- On-device inference via llama.cpp JNI</w:t>
-      </w:r>
-    </w:p>
-    <w:p>
-      <w:pPr>
-        <w:pStyle w:val="ListBullet"/>
-      </w:pPr>
-      <w:r>
-        <w:t>ApiInferenceServiceImpl.kt -- Cloud inference (OpenAI-compatible APIs)</w:t>
-      </w:r>
-    </w:p>
-    <w:p>
-      <w:pPr>
-        <w:pStyle w:val="ListBullet"/>
-      </w:pPr>
-      <w:r>
-        <w:t>ToolPromptComposer.kt / SearchToolPromptComposerImpl.kt -- Builds system prompts with tool descriptions</w:t>
-      </w:r>
-    </w:p>
-    <w:p>
-      <w:pPr>
-        <w:pStyle w:val="ListBullet"/>
-      </w:pPr>
-      <w:r>
-        <w:t>ToolStreamGateSession.kt -- Manages streaming tool call detection state per conversation turn</w:t>
-      </w:r>
-    </w:p>
-    <w:p>
-      <w:pPr>
-        <w:pStyle w:val="Heading1"/>
-      </w:pPr>
-      <w:r>
-        <w:t>14. Summary</w:t>
-      </w:r>
-    </w:p>
-    <w:p>
-      <w:r>
-        <w:rPr>
-          <w:b w:val="0"/>
-          <w:i w:val="0"/>
-          <w:sz w:val="22"/>
-        </w:rPr>
-        <w:t>The Pocket Crew agent architecture is a clear separation of concerns: the Rust agent_core engine owns all deterministic agent-loop logic (state machine, compaction, repair, guardrails, context management), while the Kotlin/Android layer owns I/O (provider inference, tool execution, summarization, UI). The two communicate through a submit-style protocol over UniFFI, where Rust yields actions and Kotlin fulfills them. This design ensures that all policy decisions are made in one place (Rust) and are fully testable without an Android device, while the Android layer remains a thin orchestration shell that just bridges engine requests to real services.</w:t>
-      </w:r>
-    </w:p>
-    <w:sectPr>
-      <w:pgSz w:w="12240" w:h="15840"/>
-      <w:pgMar w:top="1440" w:right="1440" w:bottom="1440" w:left="1440" w:header="720" w:footer="720" w:gutter="0"/>
-      <w:cols w:space="720"/>
-      <w:docGrid w:linePitch="360"/>
-    </w:sectPr>
-  </w:body>
-</w:document>
+<ns0:document xmlns:ns0="http://schemas.openxmlformats.org/wordprocessingml/2006/main" xmlns:ns1="http://schemas.openxmlformats.org/markup-compatibility/2006" ns1:Ignorable="w14 wp14">
+  <ns0:body>
+    <ns0:p>
+      <ns0:pPr>
+        <ns0:pStyle ns0:val="Title"/>
+        <ns0:jc ns0:val="center"/>
+      </ns0:pPr>
+      <ns0:r>
+        <ns0:t>Pocket Crew Agent Core Architecture</ns0:t>
+      </ns0:r>
+    </ns0:p>
+    <ns0:p>
+      <ns0:r>
+        <ns0:rPr>
+          <ns0:b ns0:val="0"/>
+          <ns0:i ns0:val="0"/>
+          <ns0:sz ns0:val="22"/>
+        </ns0:rPr>
+      </ns0:r>
+    </ns0:p>
+    <ns0:p>
+      <ns0:pPr>
+        <ns0:jc ns0:val="center"/>
+      </ns0:pPr>
+      <ns0:r>
+        <ns0:rPr>
+          <ns0:b/>
+          <ns0:i ns0:val="0"/>
+          <ns0:sz ns0:val="22"/>
+        </ns0:rPr>
+        <ns0:t>High-Level Architecture Overview</ns0:t>
+      </ns0:r>
+    </ns0:p>
+    <ns0:p>
+      <ns0:r>
+        <ns0:rPr>
+          <ns0:b ns0:val="0"/>
+          <ns0:i ns0:val="0"/>
+          <ns0:sz ns0:val="22"/>
+        </ns0:rPr>
+        <ns0:t>How agent_core (Rust) interacts with Kotlin code, including the agent loop, tool calling, parsing, and compaction systems.</ns0:t>
+      </ns0:r>
+    </ns0:p>
+    <ns0:p>
+      <ns0:r>
+        <ns0:rPr>
+          <ns0:b ns0:val="0"/>
+          <ns0:i ns0:val="0"/>
+          <ns0:sz ns0:val="22"/>
+        </ns0:rPr>
+      </ns0:r>
+    </ns0:p>
+    <ns0:p>
+      <ns0:r>
+        <ns0:rPr>
+          <ns0:b ns0:val="0"/>
+          <ns0:i/>
+          <ns0:sz ns0:val="22"/>
+        </ns0:rPr>
+        <ns0:t>Generated: 2026-05-18</ns0:t>
+      </ns0:r>
+    </ns0:p>
+    <ns0:p>
+      <ns0:r>
+        <ns0:br ns0:type="page"/>
+      </ns0:r>
+    </ns0:p>
+    <ns0:p>
+      <ns0:pPr>
+        <ns0:pStyle ns0:val="Heading1"/>
+      </ns0:pPr>
+      <ns0:r>
+        <ns0:t>Table of Contents</ns0:t>
+      </ns0:r>
+    </ns0:p>
+    <ns0:p>
+      <ns0:r>
+        <ns0:rPr>
+          <ns0:b ns0:val="0"/>
+          <ns0:i ns0:val="0"/>
+          <ns0:sz ns0:val="22"/>
+        </ns0:rPr>
+        <ns0:t>1. Architecture Overview</ns0:t>
+      </ns0:r>
+    </ns0:p>
+    <ns0:p>
+      <ns0:r>
+        <ns0:rPr>
+          <ns0:b ns0:val="0"/>
+          <ns0:i ns0:val="0"/>
+          <ns0:sz ns0:val="22"/>
+        </ns0:rPr>
+        <ns0:t>2. The Agent Loop (Rust Engine)</ns0:t>
+      </ns0:r>
+    </ns0:p>
+    <ns0:p>
+      <ns0:r>
+        <ns0:rPr>
+          <ns0:b ns0:val="0"/>
+          <ns0:i ns0:val="0"/>
+          <ns0:sz ns0:val="22"/>
+        </ns0:rPr>
+        <ns0:t xml:space="preserve">   2.1 State Machine</ns0:t>
+      </ns0:r>
+    </ns0:p>
+    <ns0:p>
+      <ns0:r>
+        <ns0:rPr>
+          <ns0:b ns0:val="0"/>
+          <ns0:i ns0:val="0"/>
+          <ns0:sz ns0:val="22"/>
+        </ns0:rPr>
+        <ns0:t xml:space="preserve">   2.2 Submit-Style Protocol</ns0:t>
+      </ns0:r>
+    </ns0:p>
+    <ns0:p>
+      <ns0:r>
+        <ns0:rPr>
+          <ns0:b ns0:val="0"/>
+          <ns0:i ns0:val="0"/>
+          <ns0:sz ns0:val="22"/>
+        </ns0:rPr>
+        <ns0:t xml:space="preserve">   2.3 Envelope Parsing</ns0:t>
+      </ns0:r>
+    </ns0:p>
+    <ns0:p>
+      <ns0:r>
+        <ns0:rPr>
+          <ns0:b ns0:val="0"/>
+          <ns0:i ns0:val="0"/>
+          <ns0:sz ns0:val="22"/>
+        </ns0:rPr>
+        <ns0:t xml:space="preserve">   2.4 Tool Repair Pipeline</ns0:t>
+      </ns0:r>
+    </ns0:p>
+    <ns0:p>
+      <ns0:r>
+        <ns0:rPr>
+          <ns0:b ns0:val="0"/>
+          <ns0:i ns0:val="0"/>
+          <ns0:sz ns0:val="22"/>
+        </ns0:rPr>
+        <ns0:t xml:space="preserve">   2.5 Compaction Tiers</ns0:t>
+      </ns0:r>
+    </ns0:p>
+    <ns0:p>
+      <ns0:r>
+        <ns0:rPr>
+          <ns0:b ns0:val="0"/>
+          <ns0:i ns0:val="0"/>
+          <ns0:sz ns0:val="22"/>
+        </ns0:rPr>
+        <ns0:t xml:space="preserve">   2.6 Guardrails</ns0:t>
+      </ns0:r>
+    </ns0:p>
+    <ns0:p>
+      <ns0:r>
+        <ns0:rPr>
+          <ns0:b ns0:val="0"/>
+          <ns0:i ns0:val="0"/>
+          <ns0:sz ns0:val="22"/>
+        </ns0:rPr>
+        <ns0:t>3. UniFFI Bridge (core/agent)</ns0:t>
+      </ns0:r>
+    </ns0:p>
+    <ns0:p>
+      <ns0:r>
+        <ns0:rPr>
+          <ns0:b ns0:val="0"/>
+          <ns0:i ns0:val="0"/>
+          <ns0:sz ns0:val="22"/>
+        </ns0:rPr>
+        <ns0:t xml:space="preserve">   3.1 How UniFFI Connects Rust to Kotlin</ns0:t>
+      </ns0:r>
+    </ns0:p>
+    <ns0:p>
+      <ns0:r>
+        <ns0:rPr>
+          <ns0:b ns0:val="0"/>
+          <ns0:i ns0:val="0"/>
+          <ns0:sz ns0:val="22"/>
+        </ns0:rPr>
+        <ns0:t xml:space="preserve">   3.2 Kotlin Adapter Classes</ns0:t>
+      </ns0:r>
+    </ns0:p>
+    <ns0:p>
+      <ns0:r>
+        <ns0:rPr>
+          <ns0:b ns0:val="0"/>
+          <ns0:i ns0:val="0"/>
+          <ns0:sz ns0:val="22"/>
+        </ns0:rPr>
+        <ns0:t>4. Kotlin Feature Layer (feature/inference)</ns0:t>
+      </ns0:r>
+    </ns0:p>
+    <ns0:p>
+      <ns0:r>
+        <ns0:rPr>
+          <ns0:b ns0:val="0"/>
+          <ns0:i ns0:val="0"/>
+          <ns0:sz ns0:val="22"/>
+        </ns0:rPr>
+        <ns0:t xml:space="preserve">   4.1 Inference Services</ns0:t>
+      </ns0:r>
+    </ns0:p>
+    <ns0:p>
+      <ns0:r>
+        <ns0:rPr>
+          <ns0:b ns0:val="0"/>
+          <ns0:i ns0:val="0"/>
+          <ns0:sz ns0:val="22"/>
+        </ns0:rPr>
+        <ns0:t xml:space="preserve">   4.2 The Agent Loop from Kotlin's Perspective</ns0:t>
+      </ns0:r>
+    </ns0:p>
+    <ns0:p>
+      <ns0:r>
+        <ns0:rPr>
+          <ns0:b ns0:val="0"/>
+          <ns0:i ns0:val="0"/>
+          <ns0:sz ns0:val="22"/>
+        </ns0:rPr>
+        <ns0:t xml:space="preserve">   4.3 Tool Execution Flow</ns0:t>
+      </ns0:r>
+    </ns0:p>
+    <ns0:p>
+      <ns0:r>
+        <ns0:rPr>
+          <ns0:b ns0:val="0"/>
+          <ns0:i ns0:val="0"/>
+          <ns0:sz ns0:val="22"/>
+        </ns0:rPr>
+        <ns0:t xml:space="preserve">   4.4 Streaming and the Tool Stream Gate</ns0:t>
+      </ns0:r>
+    </ns0:p>
+    <ns0:p>
+      <ns0:r>
+        <ns0:rPr>
+          <ns0:b ns0:val="0"/>
+          <ns0:i ns0:val="0"/>
+          <ns0:sz ns0:val="22"/>
+        </ns0:rPr>
+        <ns0:t>5. Complete Lifecycle: A User Message</ns0:t>
+      </ns0:r>
+    </ns0:p>
+    <ns0:p>
+      <ns0:r>
+        <ns0:rPr>
+          <ns0:b ns0:val="0"/>
+          <ns0:i ns0:val="0"/>
+          <ns0:sz ns0:val="22"/>
+        </ns0:rPr>
+        <ns0:t>6. Compaction in Detail</ns0:t>
+      </ns0:r>
+    </ns0:p>
+    <ns0:p>
+      <ns0:r>
+        <ns0:rPr>
+          <ns0:b ns0:val="0"/>
+          <ns0:i ns0:val="0"/>
+          <ns0:sz ns0:val="22"/>
+        </ns0:rPr>
+        <ns0:t>7. Standalone Policy Functions</ns0:t>
+      </ns0:r>
+    </ns0:p>
+    <ns0:p>
+      <ns0:r>
+        <ns0:rPr>
+          <ns0:b ns0:val="0"/>
+          <ns0:i ns0:val="0"/>
+          <ns0:sz ns0:val="22"/>
+        </ns0:rPr>
+        <ns0:t>8. Key Configuration (AgentConfig)</ns0:t>
+      </ns0:r>
+    </ns0:p>
+    <ns0:p>
+      <ns0:r>
+        <ns0:rPr>
+          <ns0:b ns0:val="0"/>
+          <ns0:i ns0:val="0"/>
+          <ns0:sz ns0:val="22"/>
+        </ns0:rPr>
+        <ns0:t>9. Error Handling and Self-Healing</ns0:t>
+      </ns0:r>
+    </ns0:p>
+    <ns0:p>
+      <ns0:r>
+        <ns0:rPr>
+          <ns0:b ns0:val="0"/>
+          <ns0:i ns0:val="0"/>
+          <ns0:sz ns0:val="22"/>
+        </ns0:rPr>
+        <ns0:t>10. Threading Model</ns0:t>
+      </ns0:r>
+    </ns0:p>
+    <ns0:p>
+      <ns0:r>
+        <ns0:rPr>
+          <ns0:b ns0:val="0"/>
+          <ns0:i ns0:val="0"/>
+          <ns0:sz ns0:val="22"/>
+        </ns0:rPr>
+        <ns0:t>11. Binding Regeneration</ns0:t>
+      </ns0:r>
+    </ns0:p>
+    <ns0:p>
+      <ns0:r>
+        <ns0:rPr>
+          <ns0:b ns0:val="0"/>
+          <ns0:i ns0:val="0"/>
+          <ns0:sz ns0:val="22"/>
+        </ns0:rPr>
+        <ns0:t>12. Visual Summary: Data Flow</ns0:t>
+      </ns0:r>
+    </ns0:p>
+    <ns0:p>
+      <ns0:r>
+        <ns0:rPr>
+          <ns0:b ns0:val="0"/>
+          <ns0:i ns0:val="0"/>
+          <ns0:sz ns0:val="22"/>
+        </ns0:rPr>
+        <ns0:t>13. Module Map</ns0:t>
+      </ns0:r>
+    </ns0:p>
+    <ns0:p>
+      <ns0:r>
+        <ns0:rPr>
+          <ns0:b ns0:val="0"/>
+          <ns0:i ns0:val="0"/>
+          <ns0:sz ns0:val="22"/>
+        </ns0:rPr>
+        <ns0:t>14. Summary</ns0:t>
+      </ns0:r>
+    </ns0:p>
+    <ns0:p>
+      <ns0:r>
+        <ns0:br ns0:type="page"/>
+      </ns0:r>
+    </ns0:p>
+    <ns0:p>
+      <ns0:pPr>
+        <ns0:pStyle ns0:val="Heading1"/>
+      </ns0:pPr>
+      <ns0:r>
+        <ns0:t>1. Architecture Overview</ns0:t>
+      </ns0:r>
+    </ns0:p>
+    <ns0:p>
+      <ns0:r>
+        <ns0:rPr>
+          <ns0:b ns0:val="0"/>
+          <ns0:i ns0:val="0"/>
+          <ns0:sz ns0:val="22"/>
+        </ns0:rPr>
+        <ns0:t>Pocket Crew uses a hybrid Rust/Kotlin architecture for its agent loop. The Rust agent_core crate (in third_party/agent_core/) owns all deterministic agent-loop logic: state machine transitions, tool call parsing and repair, context compaction, guardrails, and session management. The Kotlin/Android layer (core/agent/ and feature/inference/) owns all I/O: calling model providers, executing tools, and generating summaries.</ns0:t>
+      </ns0:r>
+    </ns0:p>
+    <ns0:p>
+      <ns0:r>
+        <ns0:rPr>
+          <ns0:b ns0:val="0"/>
+          <ns0:i ns0:val="0"/>
+          <ns0:sz ns0:val="22"/>
+        </ns0:rPr>
+        <ns0:t>The two layers communicate through a submit-style protocol over UniFFI (Mozilla's foreign-function interface generator). Rust yields actions (CallModel, ExecuteTools, RequestSummary, Finished) and Kotlin fulfills them. This design ensures that all policy decisions live in one place (Rust) and are fully testable without an Android device, while the Android layer remains a thin orchestration shell.</ns0:t>
+      </ns0:r>
+    </ns0:p>
+    <ns0:p>
+      <ns0:r>
+        <ns0:rPr>
+          <ns0:b/>
+          <ns0:i ns0:val="0"/>
+          <ns0:sz ns0:val="22"/>
+        </ns0:rPr>
+        <ns0:t>The key architectural principle: Rust decides, Kotlin acts.</ns0:t>
+      </ns0:r>
+    </ns0:p>
+    <ns0:p>
+      <ns0:r>
+        <ns0:rPr>
+          <ns0:b ns0:val="0"/>
+          <ns0:i ns0:val="0"/>
+          <ns0:sz ns0:val="22"/>
+        </ns0:rPr>
+        <ns0:t>The Rust engine never directly calls a model API, executes a tool, or touches Android frameworks. Instead, it yields an action like CallModel, and the Kotlin adapter calls the appropriate inference service, then submits the response back via submitModelResponse(). This inversion of control means the Rust engine can be unit-tested with pure data inputs and outputs, without mocking HTTP clients or Android services.</ns0:t>
+      </ns0:r>
+    </ns0:p>
+    <ns0:p>
+      <ns0:pPr>
+        <ns0:pStyle ns0:val="Heading1"/>
+      </ns0:pPr>
+      <ns0:r>
+        <ns0:t>2. The Agent Loop (Rust Engine)</ns0:t>
+      </ns0:r>
+    </ns0:p>
+    <ns0:p>
+      <ns0:pPr>
+        <ns0:pStyle ns0:val="Heading2"/>
+      </ns0:pPr>
+      <ns0:r>
+        <ns0:t>2.1 State Machine</ns0:t>
+      </ns0:r>
+    </ns0:p>
+    <ns0:p>
+      <ns0:r>
+        <ns0:rPr>
+          <ns0:b ns0:val="0"/>
+          <ns0:i ns0:val="0"/>
+          <ns0:sz ns0:val="22"/>
+        </ns0:rPr>
+        <ns0:t>The agent loop is a finite state machine with these phases:</ns0:t>
+      </ns0:r>
+    </ns0:p>
+    <ns0:p>
+      <ns0:pPr>
+        <ns0:pStyle ns0:val="ListBullet"/>
+      </ns0:pPr>
+      <ns0:r>
+        <ns0:t>Idle: Preparing to request a model turn. Runs preflight compaction if needed, then yields CallModel.</ns0:t>
+      </ns0:r>
+    </ns0:p>
+    <ns0:p>
+      <ns0:pPr>
+        <ns0:pStyle ns0:val="ListBullet"/>
+      </ns0:pPr>
+      <ns0:r>
+        <ns0:t>AwaitingModel: Waiting for Kotlin to complete a model inference turn and submit the response.</ns0:t>
+      </ns0:r>
+    </ns0:p>
+    <ns0:p>
+      <ns0:pPr>
+        <ns0:pStyle ns0:val="ListBullet"/>
+      </ns0:pPr>
+      <ns0:r>
+        <ns0:t>ProcessingModelResponse: Parsing tool calls from model output, running repair, checking guardrails, running mid-turn compaction.</ns0:t>
+      </ns0:r>
+    </ns0:p>
+    <ns0:p>
+      <ns0:pPr>
+        <ns0:pStyle ns0:val="ListBullet"/>
+      </ns0:pPr>
+      <ns0:r>
+        <ns0:t>AwaitingTools: Waiting for Kotlin to execute tool calls and submit results.</ns0:t>
+      </ns0:r>
+    </ns0:p>
+    <ns0:p>
+      <ns0:pPr>
+        <ns0:pStyle ns0:val="ListBullet"/>
+      </ns0:pPr>
+      <ns0:r>
+        <ns0:t>ProcessingToolResults: Truncating results, spilling to ContextStore, checking for soft failures, running post-tool-result compaction.</ns0:t>
+      </ns0:r>
+    </ns0:p>
+    <ns0:p>
+      <ns0:pPr>
+        <ns0:pStyle ns0:val="ListBullet"/>
+      </ns0:pPr>
+      <ns0:r>
+        <ns0:t>AwaitingSummary: Waiting for Kotlin to generate a summary of a message range.</ns0:t>
+      </ns0:r>
+    </ns0:p>
+    <ns0:p>
+      <ns0:pPr>
+        <ns0:pStyle ns0:val="ListBullet"/>
+      </ns0:pPr>
+      <ns0:r>
+        <ns0:t>Finished: Session complete, loop exits.</ns0:t>
+      </ns0:r>
+    </ns0:p>
+    <ns0:p>
+      <ns0:pPr>
+        <ns0:pStyle ns0:val="ListBullet"/>
+      </ns0:pPr>
+      <ns0:r>
+        <ns0:t>Failed: Unrecoverable error, loop exits with error.</ns0:t>
+      </ns0:r>
+    </ns0:p>
+    <ns0:p>
+      <ns0:r>
+        <ns0:rPr>
+          <ns0:b ns0:val="0"/>
+          <ns0:i ns0:val="0"/>
+          <ns0:sz ns0:val="22"/>
+        </ns0:rPr>
+        <ns0:t>Each transition is deterministic: given the same session state and submitted data, the engine always makes the same decision. The only non-determinism comes from the model output and tool results, both of which originate outside the engine.</ns0:t>
+      </ns0:r>
+    </ns0:p>
+    <ns0:p>
+      <ns0:pPr>
+        <ns0:pStyle ns0:val="Heading2"/>
+      </ns0:pPr>
+      <ns0:r>
+        <ns0:t>2.2 Submit-Style Protocol</ns0:t>
+      </ns0:r>
+    </ns0:p>
+    <ns0:p>
+      <ns0:r>
+        <ns0:rPr>
+          <ns0:b ns0:val="0"/>
+          <ns0:i ns0:val="0"/>
+          <ns0:sz ns0:val="22"/>
+        </ns0:rPr>
+        <ns0:t>The engine uses a submit-style (co-routine-like) protocol rather than callbacks. The flow is:</ns0:t>
+      </ns0:r>
+    </ns0:p>
+    <ns0:p>
+      <ns0:pPr>
+        <ns0:pStyle ns0:val="ListNumber"/>
+      </ns0:pPr>
+      <ns0:r>
+        <ns0:t>Kotlin calls nextAction(session) to get the next action.</ns0:t>
+      </ns0:r>
+    </ns0:p>
+    <ns0:p>
+      <ns0:pPr>
+        <ns0:pStyle ns0:val="ListNumber"/>
+      </ns0:pPr>
+      <ns0:r>
+        <ns0:t>Rust returns an AgentAction variant (CallModel, ExecuteTools, RequestSummary, Finished, Failed).</ns0:t>
+      </ns0:r>
+    </ns0:p>
+    <ns0:p>
+      <ns0:pPr>
+        <ns0:pStyle ns0:val="ListNumber"/>
+      </ns0:pPr>
+      <ns0:r>
+        <ns0:t>Kotlin fulfills the action (calls model, executes tools, generates summary).</ns0:t>
+      </ns0:r>
+    </ns0:p>
+    <ns0:p>
+      <ns0:pPr>
+        <ns0:pStyle ns0:val="ListNumber"/>
+      </ns0:pPr>
+      <ns0:r>
+        <ns0:t>Kotlin calls submitModelResponse(), submitModelTurnFailure(), submitToolResults(), or submitSummary() to feed results back.</ns0:t>
+      </ns0:r>
+    </ns0:p>
+    <ns0:p>
+      <ns0:pPr>
+        <ns0:pStyle ns0:val="ListNumber"/>
+      </ns0:pPr>
+      <ns0:r>
+        <ns0:t>Rust processes the submitted data, updates session state, and returns to step 1.</ns0:t>
+      </ns0:r>
+    </ns0:p>
+    <ns0:p>
+      <ns0:r>
+        <ns0:rPr>
+          <ns0:b ns0:val="0"/>
+          <ns0:i ns0:val="0"/>
+          <ns0:sz ns0:val="22"/>
+        </ns0:rPr>
+        <ns0:t>This style is preferred over callbacks because it avoids complex lifetime management across the FFI boundary and makes the control flow explicit and easy to test.</ns0:t>
+      </ns0:r>
+    </ns0:p>
+    <ns0:p>
+      <ns0:pPr>
+        <ns0:pStyle ns0:val="Heading2"/>
+      </ns0:pPr>
+      <ns0:r>
+        <ns0:t>2.3 Envelope Parsing</ns0:t>
+      </ns0:r>
+    </ns0:p>
+    <ns0:p>
+      <ns0:r>
+        <ns0:rPr>
+          <ns0:b ns0:val="0"/>
+          <ns0:i ns0:val="0"/>
+          <ns0:sz ns0:val="22"/>
+        </ns0:rPr>
+        <ns0:t>Many LLM providers (especially on-device models) do not support native tool calling. Instead, the model emits tool calls as text embedded in its response. The Rust engine's envelope parser extracts these from free-form text. Supported envelope formats include:</ns0:t>
+      </ns0:r>
+    </ns0:p>
+    <ns0:p>
+      <ns0:pPr>
+        <ns0:pStyle ns0:val="ListBullet"/>
+      </ns0:pPr>
+      <ns0:r>
+        <ns0:t>XML tags (Claude-style)</ns0:t>
+      </ns0:r>
+    </ns0:p>
+    <ns0:p>
+      <ns0:pPr>
+        <ns0:pStyle ns0:val="ListBullet"/>
+      </ns0:pPr>
+      <ns0:r>
+        <ns0:t>```tool_calls JSON code blocks</ns0:t>
+      </ns0:r>
+    </ns0:p>
+    <ns0:p>
+      <ns0:pPr>
+        <ns0:pStyle ns0:val="ListBullet"/>
+      </ns0:pPr>
+      <ns0:r>
+        <ns0:t>Anthropic-style XML tags</ns0:t>
+      </ns0:r>
+    </ns0:p>
+    <ns0:p>
+      <ns0:pPr>
+        <ns0:pStyle ns0:val="ListBullet"/>
+      </ns0:pPr>
+      <ns0:r>
+        <ns0:t>[TOOL_CALLS] JSON arrays (Mistral-style)</ns0:t>
+      </ns0:r>
+    </ns0:p>
+    <ns0:p>
+      <ns0:pPr>
+        <ns0:pStyle ns0:val="ListBullet"/>
+      </ns0:pPr>
+      <ns0:r>
+        <ns0:t>DSML &lt;invoke name="..."&gt; markup (DeepSeek/GitHub Copilot-style)</ns0:t>
+      </ns0:r>
+    </ns0:p>
+    <ns0:p>
+      <ns0:pPr>
+        <ns0:pStyle ns0:val="ListBullet"/>
+      </ns0:pPr>
+      <ns0:r>
+        <ns0:t>&lt;![CDATA[&lt;tool&gt;...&lt;/tool&gt;]]&gt; CDATA envelopes</ns0:t>
+      </ns0:r>
+    </ns0:p>
+    <ns0:p>
+      <ns0:pPr>
+        <ns0:pStyle ns0:val="ListBullet"/>
+      </ns0:pPr>
+      <ns0:r>
+        <ns0:t>Raw JSON objects with "name" fields (OpenAI function calling)</ns0:t>
+      </ns0:r>
+    </ns0:p>
+    <ns0:p>
+      <ns0:pPr>
+        <ns0:pStyle ns0:val="ListBullet"/>
+      </ns0:pPr>
+      <ns0:r>
+        <ns0:t>GLM-style name&lt;key&gt;value&lt;/key&gt; inline format</ns0:t>
+      </ns0:r>
+    </ns0:p>
+    <ns0:p>
+      <ns0:r>
+        <ns0:rPr>
+          <ns0:b ns0:val="0"/>
+          <ns0:i ns0:val="0"/>
+          <ns0:sz ns0:val="22"/>
+        </ns0:rPr>
+        <ns0:t>Each extracted envelope goes through JSON repair (fixing single quotes, trailing commas, bracket escaping) and then through the full repair + coercion pipeline described above.</ns0:t>
+      </ns0:r>
+    </ns0:p>
+    <ns0:p>
+      <ns0:pPr>
+        <ns0:pStyle ns0:val="Heading2"/>
+      </ns0:pPr>
+      <ns0:r>
+        <ns0:t>2.4 Tool Repair Pipeline</ns0:t>
+      </ns0:r>
+    </ns0:p>
+    <ns0:p>
+      <ns0:r>
+        <ns0:rPr>
+          <ns0:b ns0:val="0"/>
+          <ns0:i ns0:val="0"/>
+          <ns0:sz ns0:val="22"/>
+        </ns0:rPr>
+        <ns0:t>When an envelope is parsed, the ToolRepairPipeline runs:</ns0:t>
+      </ns0:r>
+    </ns0:p>
+    <ns0:p>
+      <ns0:pPr>
+        <ns0:pStyle ns0:val="ListNumber"/>
+      </ns0:pPr>
+      <ns0:r>
+        <ns0:t>Name normalization: Strip "functions." or "tools." prefixes, convert hyphens/spaces to underscores, lowercase.</ns0:t>
+      </ns0:r>
+    </ns0:p>
+    <ns0:p>
+      <ns0:pPr>
+        <ns0:pStyle ns0:val="ListNumber"/>
+      </ns0:pPr>
+      <ns0:r>
+        <ns0:t>Catalog resolution: Look up the normalized name in ToolCatalog. If not found, apply Levenshtein fuzzy matching against known tool names.</ns0:t>
+      </ns0:r>
+    </ns0:p>
+    <ns0:p>
+      <ns0:pPr>
+        <ns0:pStyle ns0:val="ListNumber"/>
+      </ns0:pPr>
+      <ns0:r>
+        <ns0:t>Schema coercion: If a tool is found, coerce the arguments JSON to match the expected schema (type coercion, default injection, unknown parameter rejection).</ns0:t>
+      </ns0:r>
+    </ns0:p>
+    <ns0:p>
+      <ns0:pPr>
+        <ns0:pStyle ns0:val="ListNumber"/>
+      </ns0:pPr>
+      <ns0:r>
+        <ns0:t>Validation: Check for required parameters and reject unknown parameters.</ns0:t>
+      </ns0:r>
+    </ns0:p>
+    <ns0:p>
+      <ns0:r>
+        <ns0:rPr>
+          <ns0:b ns0:val="0"/>
+          <ns0:i ns0:val="0"/>
+          <ns0:sz ns0:val="22"/>
+        </ns0:rPr>
+        <ns0:t>If repair succeeds, a ToolCallRecord is created with optional repair_metadata. If repair rejects (unknown tool, ambiguous match, missing required params), an error message is injected into the session as a tool result, and the model gets another chance.</ns0:t>
+      </ns0:r>
+    </ns0:p>
+    <ns0:p>
+      <ns0:pPr>
+        <ns0:pStyle ns0:val="Heading2"/>
+      </ns0:pPr>
+      <ns0:r>
+        <ns0:t>2.5 Compaction Tiers</ns0:t>
+      </ns0:r>
+    </ns0:p>
+    <ns0:p>
+      <ns0:r>
+        <ns0:rPr>
+          <ns0:b ns0:val="0"/>
+          <ns0:i ns0:val="0"/>
+          <ns0:sz ns0:val="22"/>
+        </ns0:rPr>
+        <ns0:t>When context pressure (estimated token count / context window) exceeds a threshold, the engine runs compaction. Tiers are tried in order:</ns0:t>
+      </ns0:r>
+    </ns0:p>
+    <ns0:p>
+      <ns0:pPr>
+        <ns0:pStyle ns0:val="ListBullet"/>
+      </ns0:pPr>
+      <ns0:r>
+        <ns0:t>Micro: Remove recent redundant messages (duplicate user messages, consecutive assistant turns).</ns0:t>
+      </ns0:r>
+    </ns0:p>
+    <ns0:p>
+      <ns0:pPr>
+        <ns0:pStyle ns0:val="ListBullet"/>
+      </ns0:pPr>
+      <ns0:r>
+        <ns0:t>FIFO: Evict oldest user/assistant pairs, keeping micro_keep_recent pairs intact.</ns0:t>
+      </ns0:r>
+    </ns0:p>
+    <ns0:p>
+      <ns0:pPr>
+        <ns0:pStyle ns0:val="ListBullet"/>
+      </ns0:pPr>
+      <ns0:r>
+        <ns0:t>ArtifactSquash: Consolidate artifact state (start_artifact + append_blocks) into a single reference.</ns0:t>
+      </ns0:r>
+    </ns0:p>
+    <ns0:p>
+      <ns0:pPr>
+        <ns0:pStyle ns0:val="ListBullet"/>
+      </ns0:pPr>
+      <ns0:r>
+        <ns0:t>Summary: Ask the host to summarize a message range and replace it with a compact summary message.</ns0:t>
+      </ns0:r>
+    </ns0:p>
+    <ns0:p>
+      <ns0:pPr>
+        <ns0:pStyle ns0:val="ListBullet"/>
+      </ns0:pPr>
+      <ns0:r>
+        <ns0:t>ToolSpill: Move large tool results (above tool_spill_threshold_bytes) from the message history into ContextStore references.</ns0:t>
+      </ns0:r>
+    </ns0:p>
+    <ns0:p>
+      <ns0:pPr>
+        <ns0:pStyle ns0:val="ListBullet"/>
+      </ns0:pPr>
+      <ns0:r>
+        <ns0:t>HistorySnapshot: Snapshot the full message range into ContextStore and replace with a reference, keeping only recent context.</ns0:t>
+      </ns0:r>
+    </ns0:p>
+    <ns0:p>
+      <ns0:r>
+        <ns0:rPr>
+          <ns0:b ns0:val="0"/>
+          <ns0:i ns0:val="0"/>
+          <ns0:sz ns0:val="22"/>
+        </ns0:rPr>
+        <ns0:t>Compaction can be triggered at four points: Preflight (before a model request), MidTurn (after receiving tool calls from the model), PostToolResult (after executing tools), and Manual (user-initiated).</ns0:t>
+      </ns0:r>
+    </ns0:p>
+    <ns0:p>
+      <ns0:pPr>
+        <ns0:pStyle ns0:val="Heading2"/>
+      </ns0:pPr>
+      <ns0:r>
+        <ns0:t>2.6 Guardrails</ns0:t>
+      </ns0:r>
+    </ns0:p>
+    <ns0:p>
+      <ns0:r>
+        <ns0:rPr>
+          <ns0:b ns0:val="0"/>
+          <ns0:i ns0:val="0"/>
+          <ns0:sz ns0:val="22"/>
+        </ns0:rPr>
+        <ns0:t>The GuardrailState tracks tool call counts and soft-failure streaks per session. Key guardrails:</ns0:t>
+      </ns0:r>
+    </ns0:p>
+    <ns0:p>
+      <ns0:pPr>
+        <ns0:pStyle ns0:val="ListBullet"/>
+      </ns0:pPr>
+      <ns0:r>
+        <ns0:t>Max turns: When the turn count reaches maxTurns, tool calls are disabled (allow_tool_call=false) but the model is still called for a final text response.</ns0:t>
+      </ns0:r>
+    </ns0:p>
+    <ns0:p>
+      <ns0:pPr>
+        <ns0:pStyle ns0:val="ListBullet"/>
+      </ns0:pPr>
+      <ns0:r>
+        <ns0:t>Soft-failure streak: When consecutive tool calls result in soft failures, the engine prevents further tool calls after max_streak is reached.</ns0:t>
+      </ns0:r>
+    </ns0:p>
+    <ns0:p>
+      <ns0:pPr>
+        <ns0:pStyle ns0:val="ListBullet"/>
+      </ns0:pPr>
+      <ns0:r>
+        <ns0:t>Pending work guard: Before finishing, the engine checks for pending work items and can inject a reminder message to force the model to complete outstanding tasks.</ns0:t>
+      </ns0:r>
+    </ns0:p>
+    <ns0:p>
+      <ns0:pPr>
+        <ns0:pStyle ns0:val="ListBullet"/>
+      </ns0:pPr>
+      <ns0:r>
+        <ns0:t>Artifact auto-finalization: When the model finishes (finish_reason=Stop) but has open artifacts, synthetic finalize_artifact tool calls are generated automatically.</ns0:t>
+      </ns0:r>
+    </ns0:p>
+    <ns0:p>
+      <ns0:pPr>
+        <ns0:pStyle ns0:val="Heading1"/>
+      </ns0:pPr>
+      <ns0:r>
+        <ns0:t>3. UniFFI Bridge (core/agent)</ns0:t>
+      </ns0:r>
+    </ns0:p>
+    <ns0:p>
+      <ns0:pPr>
+        <ns0:pStyle ns0:val="Heading2"/>
+      </ns0:pPr>
+      <ns0:r>
+        <ns0:t>3.1 How UniFFI Connects Rust to Kotlin</ns0:t>
+      </ns0:r>
+    </ns0:p>
+    <ns0:p>
+      <ns0:r>
+        <ns0:rPr>
+          <ns0:b ns0:val="0"/>
+          <ns0:i ns0:val="0"/>
+          <ns0:sz ns0:val="22"/>
+        </ns0:rPr>
+        <ns0:t>UniFFI is Mozilla's foreign-function interface generator. In this project:</ns0:t>
+      </ns0:r>
+    </ns0:p>
+    <ns0:p>
+      <ns0:pPr>
+        <ns0:pStyle ns0:val="ListNumber"/>
+      </ns0:pPr>
+      <ns0:r>
+        <ns0:t>Rust structs, enums, and functions are annotated with #[derive(uniffi::Record)], #[derive(uniffi::Enum)], and #[uniffi::export] in the agent_core crate.</ns0:t>
+      </ns0:r>
+    </ns0:p>
+    <ns0:p>
+      <ns0:pPr>
+        <ns0:pStyle ns0:val="ListNumber"/>
+      </ns0:pPr>
+      <ns0:r>
+        <ns0:t>Running scripts/build-agent-bindings.sh generates a Kotlin file (agent_core.kt) containing type-safe Kotlin representations of every FFI type.</ns0:t>
+      </ns0:r>
+    </ns0:p>
+    <ns0:p>
+      <ns0:pPr>
+        <ns0:pStyle ns0:val="ListNumber"/>
+      </ns0:pPr>
+      <ns0:r>
+        <ns0:t>The Rust crate is cross-compiled for arm64-v8a (Android) and the resulting libagent_core.so is checked in alongside the generated bindings.</ns0:t>
+      </ns0:r>
+    </ns0:p>
+    <ns0:p>
+      <ns0:r>
+        <ns0:rPr>
+          <ns0:b/>
+          <ns0:i ns0:val="0"/>
+          <ns0:sz ns0:val="22"/>
+        </ns0:rPr>
+        <ns0:t>The UniFFI boundary transfers these types:</ns0:t>
+      </ns0:r>
+    </ns0:p>
+    <ns0:p>
+      <ns0:pPr>
+        <ns0:pStyle ns0:val="ListBullet"/>
+      </ns0:pPr>
+      <ns0:r>
+        <ns0:t>FfiAgentAction (enum): CallModel, ExecuteTools, RequestSummary, Finished, Failed, ManualCompactCompleted</ns0:t>
+      </ns0:r>
+    </ns0:p>
+    <ns0:p>
+      <ns0:pPr>
+        <ns0:pStyle ns0:val="ListBullet"/>
+      </ns0:pPr>
+      <ns0:r>
+        <ns0:t>FfiModelRequest / FfiModelResponse: Structured request/response containing messages, tool calls, finish reasons</ns0:t>
+      </ns0:r>
+    </ns0:p>
+    <ns0:p>
+      <ns0:pPr>
+        <ns0:pStyle ns0:val="ListBullet"/>
+      </ns0:pPr>
+      <ns0:r>
+        <ns0:t>FfiToolCallRecord / FfiToolResultRecord: Repaired tool calls and their execution results</ns0:t>
+      </ns0:r>
+    </ns0:p>
+    <ns0:p>
+      <ns0:pPr>
+        <ns0:pStyle ns0:val="ListBullet"/>
+      </ns0:pPr>
+      <ns0:r>
+        <ns0:t>FfiAgentEvent: Telemetry events (TurnStarted, CompactionApplied, ToolRepaired, etc.)</ns0:t>
+      </ns0:r>
+    </ns0:p>
+    <ns0:p>
+      <ns0:pPr>
+        <ns0:pStyle ns0:val="ListBullet"/>
+      </ns0:pPr>
+      <ns0:r>
+        <ns0:t>FfiAgentConfig / FfiSessionCapabilities: Configuration and capability flags</ns0:t>
+      </ns0:r>
+    </ns0:p>
+    <ns0:p>
+      <ns0:pPr>
+        <ns0:pStyle ns0:val="ListBullet"/>
+      </ns0:pPr>
+      <ns0:r>
+        <ns0:t>FfiToolParseBatch: Parsed tool call envelopes with repair metadata</ns0:t>
+      </ns0:r>
+    </ns0:p>
+    <ns0:p>
+      <ns0:pPr>
+        <ns0:pStyle ns0:val="Heading2"/>
+      </ns0:pPr>
+      <ns0:r>
+        <ns0:t>3.2 Kotlin Adapter Classes</ns0:t>
+      </ns0:r>
+    </ns0:p>
+    <ns0:p>
+      <ns0:r>
+        <ns0:rPr>
+          <ns0:b ns0:val="0"/>
+          <ns0:i ns0:val="0"/>
+          <ns0:sz ns0:val="22"/>
+        </ns0:rPr>
+        <ns0:t>The core/agent module contains thin Kotlin adapters that wrap the generated UniFFI types and implement domain ports:</ns0:t>
+      </ns0:r>
+    </ns0:p>
+    <ns0:p>
+      <ns0:pPr>
+        <ns0:pStyle ns0:val="Heading3"/>
+      </ns0:pPr>
+      <ns0:r>
+        <ns0:t>3.2.1 RustAgentEngineAdapter</ns0:t>
+      </ns0:r>
+    </ns0:p>
+    <ns0:p>
+      <ns0:r>
+        <ns0:rPr>
+          <ns0:b ns0:val="0"/>
+          <ns0:i ns0:val="0"/>
+          <ns0:sz ns0:val="22"/>
+        </ns0:rPr>
+        <ns0:t>This is the primary orchestrator. It implements AgentLoopPort and drives the submit-style loop with the Rust engine. Key aspects:</ns0:t>
+      </ns0:r>
+    </ns0:p>
+    <ns0:p>
+      <ns0:pPr>
+        <ns0:pStyle ns0:val="ListBullet"/>
+      </ns0:pPr>
+      <ns0:r>
+        <ns0:t>Creates an FfiAgentEngine via createAgentEngine() with unused callback shims (the submit-style protocol doesn't use UniFFI callbacks).</ns0:t>
+      </ns0:r>
+    </ns0:p>
+    <ns0:p>
+      <ns0:pPr>
+        <ns0:pStyle ns0:val="ListBullet"/>
+      </ns0:pPr>
+      <ns0:r>
+        <ns0:t>Creates an FfiSession with initial messages, config, capabilities, IO params, and session context JSON.</ns0:t>
+      </ns0:r>
+    </ns0:p>
+    <ns0:p>
+      <ns0:pPr>
+        <ns0:pStyle ns0:val="ListBullet"/>
+      </ns0:pPr>
+      <ns0:r>
+        <ns0:t>Runs a while(true) loop that calls nextAction(session), drains events, and dispatches to the appropriate host callback on Dispatchers.IO.</ns0:t>
+      </ns0:r>
+    </ns0:p>
+    <ns0:p>
+      <ns0:pPr>
+        <ns0:pStyle ns0:val="ListBullet"/>
+      </ns0:pPr>
+      <ns0:r>
+        <ns0:t>Maps FfiAgentAction variants to domain AgentLoopEvent emissions via a Kotlin channelFlow.</ns0:t>
+      </ns0:r>
+    </ns0:p>
+    <ns0:p>
+      <ns0:pPr>
+        <ns0:pStyle ns0:val="ListBullet"/>
+      </ns0:pPr>
+      <ns0:r>
+        <ns0:t>Manages manual compaction requests and context reference read/search.</ns0:t>
+      </ns0:r>
+    </ns0:p>
+    <ns0:p>
+      <ns0:pPr>
+        <ns0:pStyle ns0:val="ListBullet"/>
+      </ns0:pPr>
+      <ns0:r>
+        <ns0:t>Converts between FfiXxx and domain types using .toFfi() and .toDomain() extension functions.</ns0:t>
+      </ns0:r>
+    </ns0:p>
+    <ns0:p>
+      <ns0:pPr>
+        <ns0:pStyle ns0:val="Heading3"/>
+      </ns0:pPr>
+      <ns0:r>
+        <ns0:t>3.2.2 RustToolEnvelopeParser</ns0:t>
+      </ns0:r>
+    </ns0:p>
+    <ns0:p>
+      <ns0:r>
+        <ns0:rPr>
+          <ns0:b ns0:val="0"/>
+          <ns0:i ns0:val="0"/>
+          <ns0:sz ns0:val="22"/>
+        </ns0:rPr>
+        <ns0:t>Implements ToolEnvelopeParserPort by delegating to the Rust parse_tool_calls() and coerce_provider_arguments() UniFFI free functions. Converts FfiToolParseBatch results to domain ToolEnvelopeBatch types.</ns0:t>
+      </ns0:r>
+    </ns0:p>
+    <ns0:p>
+      <ns0:pPr>
+        <ns0:pStyle ns0:val="Heading3"/>
+      </ns0:pPr>
+      <ns0:r>
+        <ns0:t>3.2.3 RustToolStreamGate</ns0:t>
+      </ns0:r>
+    </ns0:p>
+    <ns0:p>
+      <ns0:r>
+        <ns0:rPr>
+          <ns0:b ns0:val="0"/>
+          <ns0:i ns0:val="0"/>
+          <ns0:sz ns0:val="22"/>
+        </ns0:rPr>
+        <ns0:t>Implements ToolStreamGatePort for streaming tool call detection during model inference. Delegates to the Rust FfiToolStreamGate, which is a stateful streaming parser that buffers text and detects tool-call markers in real time.</ns0:t>
+      </ns0:r>
+    </ns0:p>
+    <ns0:p>
+      <ns0:pPr>
+        <ns0:pStyle ns0:val="Heading3"/>
+      </ns0:pPr>
+      <ns0:r>
+        <ns0:t>3.2.4 LiteRtAgentPolicyBridge</ns0:t>
+      </ns0:r>
+    </ns0:p>
+    <ns0:p>
+      <ns0:r>
+        <ns0:rPr>
+          <ns0:b ns0:val="0"/>
+          <ns0:i ns0:val="0"/>
+          <ns0:sz ns0:val="22"/>
+        </ns0:rPr>
+        <ns0:t>Implements AgentPolicyPort by delegating to Rust policy free functions: repairTool(), truncateResult(), shouldAllowTool(), resultJsonLooksSoftFailure(). These are pure functions that Android code calls for policy decisions without needing a full agent session.</ns0:t>
+      </ns0:r>
+    </ns0:p>
+    <ns0:p>
+      <ns0:pPr>
+        <ns0:pStyle ns0:val="Heading3"/>
+      </ns0:pPr>
+      <ns0:r>
+        <ns0:t>3.2.5 AgentEventMapper</ns0:t>
+      </ns0:r>
+    </ns0:p>
+    <ns0:p>
+      <ns0:r>
+        <ns0:rPr>
+          <ns0:b ns0:val="0"/>
+          <ns0:i ns0:val="0"/>
+          <ns0:sz ns0:val="22"/>
+        </ns0:rPr>
+        <ns0:t>Maps FfiAgentEvent variants to domain AgentLoopEvent types and logs them through the LoggingPort. Some events (ContextPressure, ToolSoftFailure, HookInvoked, ToolPolicyDenied, ToolTimedOut) are logged but not emitted as domain events -- they're informational only.</ns0:t>
+      </ns0:r>
+    </ns0:p>
+    <ns0:p>
+      <ns0:pPr>
+        <ns0:pStyle ns0:val="Heading1"/>
+      </ns0:pPr>
+      <ns0:r>
+        <ns0:t>4. Kotlin Feature Layer (feature/inference)</ns0:t>
+      </ns0:r>
+    </ns0:p>
+    <ns0:p>
+      <ns0:pPr>
+        <ns0:pStyle ns0:val="Heading2"/>
+      </ns0:pPr>
+      <ns0:r>
+        <ns0:t>4.1 Inference Services</ns0:t>
+      </ns0:r>
+    </ns0:p>
+    <ns0:p>
+      <ns0:r>
+        <ns0:rPr>
+          <ns0:b ns0:val="0"/>
+          <ns0:i ns0:val="0"/>
+          <ns0:sz ns0:val="22"/>
+        </ns0:rPr>
+        <ns0:t>The feature/inference module contains provider-specific inference service implementations that fulfill the model-turn responsibility:</ns0:t>
+      </ns0:r>
+    </ns0:p>
+    <ns0:p>
+      <ns0:pPr>
+        <ns0:pStyle ns0:val="ListBullet"/>
+      </ns0:pPr>
+      <ns0:r>
+        <ns0:t>LiteRtInferenceServiceImpl: On-device inference via LiteRT/TFLite. Does not support tool calling natively -- uses the Rust envelope parser to extract tool calls from free-form model text.</ns0:t>
+      </ns0:r>
+    </ns0:p>
+    <ns0:p>
+      <ns0:pPr>
+        <ns0:pStyle ns0:val="ListBullet"/>
+      </ns0:pPr>
+      <ns0:r>
+        <ns0:t>AnthropicInferenceServiceImpl, OpenAiInferenceServiceImpl, GoogleInferenceServiceImpl, XaiInferenceServiceImpl: Cloud BYOK providers. These may use native tool calling (JSON function_call) or envelope parsing depending on provider capabilities.</ns0:t>
+      </ns0:r>
+    </ns0:p>
+    <ns0:p>
+      <ns0:pPr>
+        <ns0:pStyle ns0:val="ListBullet"/>
+      </ns0:pPr>
+      <ns0:r>
+        <ns0:t>LlamaInferenceServiceImpl: On-device inference via llama.cpp JNI bridge. Similar envelope-parsing approach as LiteRT.</ns0:t>
+      </ns0:r>
+    </ns0:p>
+    <ns0:p>
+      <ns0:pPr>
+        <ns0:pStyle ns0:val="Heading2"/>
+      </ns0:pPr>
+      <ns0:r>
+        <ns0:t>4.2 The Agent Loop from Kotlin's Perspective</ns0:t>
+      </ns0:r>
+    </ns0:p>
+    <ns0:p>
+      <ns0:r>
+        <ns0:rPr>
+          <ns0:b ns0:val="0"/>
+          <ns0:i ns0:val="0"/>
+          <ns0:sz ns0:val="22"/>
+        </ns0:rPr>
+        <ns0:t>When an agent loop starts (e.g., user sends a message), the Kotlin layer:</ns0:t>
+      </ns0:r>
+    </ns0:p>
+    <ns0:p>
+      <ns0:pPr>
+        <ns0:pStyle ns0:val="ListNumber"/>
+      </ns0:pPr>
+      <ns0:r>
+        <ns0:t>Constructs AgentLoopHostCallbacks -- lambdas for completeModelTurn, executeTools, and summarize.</ns0:t>
+      </ns0:r>
+    </ns0:p>
+    <ns0:p>
+      <ns0:pPr>
+        <ns0:pStyle ns0:val="ListNumber"/>
+      </ns0:pPr>
+      <ns0:r>
+        <ns0:t>Builds AgentLoopConfig with max turns, compaction thresholds, feature flags, and session IO params (provider name, context window size, tool schemas, system prompt).</ns0:t>
+      </ns0:r>
+    </ns0:p>
+    <ns0:p>
+      <ns0:pPr>
+        <ns0:pStyle ns0:val="ListNumber"/>
+      </ns0:pPr>
+      <ns0:r>
+        <ns0:t>Passes everything to RustAgentEngineAdapter.execute(), which returns a Flow&lt;AgentLoopEvent&gt;.</ns0:t>
+      </ns0:r>
+    </ns0:p>
+    <ns0:p>
+      <ns0:pPr>
+        <ns0:pStyle ns0:val="ListNumber"/>
+      </ns0:pPr>
+      <ns0:r>
+        <ns0:t>The adapter enters its while(true) loop driving the Rust engine.</ns0:t>
+      </ns0:r>
+    </ns0:p>
+    <ns0:p>
+      <ns0:pPr>
+        <ns0:pStyle ns0:val="ListNumber"/>
+      </ns0:pPr>
+      <ns0:r>
+        <ns0:t>For each CallModel action, the adapter calls host.completeModelTurn() which dispatches to the appropriate InferenceService. Streaming tokens are forwarded as AgentLoopEvent.TextToken and AgentLoopEvent.ThinkingToken.</ns0:t>
+      </ns0:r>
+    </ns0:p>
+    <ns0:p>
+      <ns0:pPr>
+        <ns0:pStyle ns0:val="ListNumber"/>
+      </ns0:pPr>
+      <ns0:r>
+        <ns0:t>For each ExecuteTools action, the adapter calls host.executeTools() which dispatches to registered tool executors (web search, chat history search, artifact management, etc.).</ns0:t>
+      </ns0:r>
+    </ns0:p>
+    <ns0:p>
+      <ns0:pPr>
+        <ns0:pStyle ns0:val="ListNumber"/>
+      </ns0:pPr>
+      <ns0:r>
+        <ns0:t>For RequestSummary, the adapter calls host.summarize() which uses the same provider to generate a summary of the specified message range.</ns0:t>
+      </ns0:r>
+    </ns0:p>
+    <ns0:p>
+      <ns0:pPr>
+        <ns0:pStyle ns0:val="ListNumber"/>
+      </ns0:pPr>
+      <ns0:r>
+        <ns0:t>The Flow&lt;AgentLoopEvent&gt; is collected by the UI layer to update the chat screen in real time.</ns0:t>
+      </ns0:r>
+    </ns0:p>
+    <ns0:p>
+      <ns0:pPr>
+        <ns0:pStyle ns0:val="Heading2"/>
+      </ns0:pPr>
+      <ns0:r>
+        <ns0:t>4.3 Tool Execution Flow</ns0:t>
+      </ns0:r>
+    </ns0:p>
+    <ns0:p>
+      <ns0:r>
+        <ns0:rPr>
+          <ns0:b ns0:val="0"/>
+          <ns0:i ns0:val="0"/>
+          <ns0:sz ns0:val="22"/>
+        </ns0:rPr>
+        <ns0:t>When a model returns tool calls, the flow is:</ns0:t>
+      </ns0:r>
+    </ns0:p>
+    <ns0:p>
+      <ns0:pPr>
+        <ns0:pStyle ns0:val="ListNumber"/>
+      </ns0:pPr>
+      <ns0:r>
+        <ns0:t>The InferenceService returns raw tool call data (either native JSON function_call or extracted envelopes).</ns0:t>
+      </ns0:r>
+    </ns0:p>
+    <ns0:p>
+      <ns0:pPr>
+        <ns0:pStyle ns0:val="ListNumber"/>
+      </ns0:pPr>
+      <ns0:r>
+        <ns0:t>RustToolEnvelopeParser.parse() runs on the raw output to extract structured ToolEnvelopeField objects if envelope-based parsing is needed.</ns0:t>
+      </ns0:r>
+    </ns0:p>
+    <ns0:p>
+      <ns0:pPr>
+        <ns0:pStyle ns0:val="ListNumber"/>
+      </ns0:pPr>
+      <ns0:r>
+        <ns0:t>The Rust engine's ToolRepairPipeline runs during submit_model_response, normalizing names and coercing schemas.</ns0:t>
+      </ns0:r>
+    </ns0:p>
+    <ns0:p>
+      <ns0:pPr>
+        <ns0:pStyle ns0:val="ListNumber"/>
+      </ns0:pPr>
+      <ns0:r>
+        <ns0:t>The engine yields an ExecuteTools action with repaired FfiToolCallRecord objects.</ns0:t>
+      </ns0:r>
+    </ns0:p>
+    <ns0:p>
+      <ns0:pPr>
+        <ns0:pStyle ns0:val="ListNumber"/>
+      </ns0:pPr>
+      <ns0:r>
+        <ns0:t>Kotlin's RustAgentEngineAdapter maps these to domain AgentToolCall objects and calls host.executeTools().</ns0:t>
+      </ns0:r>
+    </ns0:p>
+    <ns0:p>
+      <ns0:pPr>
+        <ns0:pStyle ns0:val="ListNumber"/>
+      </ns0:pPr>
+      <ns0:r>
+        <ns0:t>Each tool executor returns an AgentToolResult with resultJson, which is converted back to FfiToolResultRecord and submitted via submitToolResults().</ns0:t>
+      </ns0:r>
+    </ns0:p>
+    <ns0:p>
+      <ns0:pPr>
+        <ns0:pStyle ns0:val="ListNumber"/>
+      </ns0:pPr>
+      <ns0:r>
+        <ns0:t>The engine processes results (truncation, spilling, compaction) and continues the loop.</ns0:t>
+      </ns0:r>
+    </ns0:p>
+    <ns0:p>
+      <ns0:pPr>
+        <ns0:pStyle ns0:val="Heading2"/>
+      </ns0:pPr>
+      <ns0:r>
+        <ns0:t>4.4 Streaming and the Tool Stream Gate</ns0:t>
+      </ns0:r>
+    </ns0:p>
+    <ns0:p>
+      <ns0:r>
+        <ns0:rPr>
+          <ns0:b ns0:val="0"/>
+          <ns0:i ns0:val="0"/>
+          <ns0:sz ns0:val="22"/>
+        </ns0:rPr>
+        <ns0:t>For providers that stream tokens, the Rust ToolStreamGate provides a stateful parser that processes text chunks incrementally. This allows the UI to show streaming text while simultaneously detecting when a tool-call envelope begins. The stream gate has three operations:</ns0:t>
+      </ns0:r>
+    </ns0:p>
+    <ns0:p>
+      <ns0:pPr>
+        <ns0:pStyle ns0:val="ListBullet"/>
+      </ns0:pPr>
+      <ns0:r>
+        <ns0:t>push(chunk): Feed text; returns the safe-to-emit text prefix (before any envelope marker).</ns0:t>
+      </ns0:r>
+    </ns0:p>
+    <ns0:p>
+      <ns0:pPr>
+        <ns0:pStyle ns0:val="ListBullet"/>
+      </ns0:pPr>
+      <ns0:r>
+        <ns0:t>finish(hasNativeToolCalls): Flush remaining buffered text and report whether tool markers were detected.</ns0:t>
+      </ns0:r>
+    </ns0:p>
+    <ns0:p>
+      <ns0:pPr>
+        <ns0:pStyle ns0:val="ListBullet"/>
+      </ns0:pPr>
+      <ns0:r>
+        <ns0:t>reset(): Reset the gate for a new turn.</ns0:t>
+      </ns0:r>
+    </ns0:p>
+    <ns0:p>
+      <ns0:r>
+        <ns0:rPr>
+          <ns0:b ns0:val="0"/>
+          <ns0:i ns0:val="0"/>
+          <ns0:sz ns0:val="22"/>
+        </ns0:rPr>
+        <ns0:t>This ensures that partial tool-call envelopes are never displayed to the user as visible text -- they're held in the gate's buffer until the envelope is complete or confirmed absent.</ns0:t>
+      </ns0:r>
+    </ns0:p>
+    <ns0:p>
+      <ns0:pPr>
+        <ns0:pStyle ns0:val="Heading1"/>
+      </ns0:pPr>
+      <ns0:r>
+        <ns0:t>5. Complete Lifecycle: A User Message</ns0:t>
+      </ns0:r>
+    </ns0:p>
+    <ns0:p>
+      <ns0:r>
+        <ns0:rPr>
+          <ns0:b ns0:val="0"/>
+          <ns0:i ns0:val="0"/>
+          <ns0:sz ns0:val="22"/>
+        </ns0:rPr>
+        <ns0:t>The following is a step-by-step walkthrough of what happens when a user sends a message that triggers tool use:</ns0:t>
+      </ns0:r>
+    </ns0:p>
+    <ns0:p>
+      <ns0:pPr>
+        <ns0:pStyle ns0:val="ListNumber"/>
+      </ns0:pPr>
+      <ns0:r>
+        <ns0:t>User sends message. ConversationManagerImpl creates initial messages and builds AgentLoopHostCallbacks.</ns0:t>
+      </ns0:r>
+    </ns0:p>
+    <ns0:p>
+      <ns0:pPr>
+        <ns0:pStyle ns0:val="ListNumber"/>
+      </ns0:pPr>
+      <ns0:r>
+        <ns0:t>RustAgentEngineAdapter.execute() creates an FfiAgentEngine + FfiSession, enters the submit loop.</ns0:t>
+      </ns0:r>
+    </ns0:p>
+    <ns0:p>
+      <ns0:pPr>
+        <ns0:pStyle ns0:val="ListNumber"/>
+      </ns0:pPr>
+      <ns0:r>
+        <ns0:t>next_action() is called. The engine runs preflight compaction (if context pressure is high), then returns CallModel with session messages, system prompt, tool schema, and context references.</ns0:t>
+      </ns0:r>
+    </ns0:p>
+    <ns0:p>
+      <ns0:pPr>
+        <ns0:pStyle ns0:val="ListNumber"/>
+      </ns0:pPr>
+      <ns0:r>
+        <ns0:t>Kotlin calls host.completeModelTurn() on Dispatchers.IO. The inference service queries the provider.</ns0:t>
+      </ns0:r>
+    </ns0:p>
+    <ns0:p>
+      <ns0:pPr>
+        <ns0:pStyle ns0:val="ListNumber"/>
+      </ns0:pPr>
+      <ns0:r>
+        <ns0:t>Model returns text with tool calls. InferenceService extracts them (native or envelope parsing). Returns AgentModelTurnResult with assistantText + toolCalls.</ns0:t>
+      </ns0:r>
+    </ns0:p>
+    <ns0:p>
+      <ns0:pPr>
+        <ns0:pStyle ns0:val="ListNumber"/>
+      </ns0:pPr>
+      <ns0:r>
+        <ns0:t>Kotlin calls engine.submitModelResponse(). The engine runs envelope parsing (if needed), tool repair (fuzzy name matching, schema coercion), generates repaired/rejected calls.</ns0:t>
+      </ns0:r>
+    </ns0:p>
+    <ns0:p>
+      <ns0:pPr>
+        <ns0:pStyle ns0:val="ListNumber"/>
+      </ns0:pPr>
+      <ns0:r>
+        <ns0:t>If tool calls survived repair, the engine runs mid-turn compaction, then returns ExecuteTools with the repaired call list.</ns0:t>
+      </ns0:r>
+    </ns0:p>
+    <ns0:p>
+      <ns0:pPr>
+        <ns0:pStyle ns0:val="ListNumber"/>
+      </ns0:pPr>
+      <ns0:r>
+        <ns0:t>Kotlin calls host.executeTools(). Each tool executor runs (web search, artifact calls, etc.) and returns results.</ns0:t>
+      </ns0:r>
+    </ns0:p>
+    <ns0:p>
+      <ns0:pPr>
+        <ns0:pStyle ns0:val="ListNumber"/>
+      </ns0:pPr>
+      <ns0:r>
+        <ns0:t>Kotlin calls engine.submitToolResults(). The engine processes results (truncation, spilling, soft-failure detection), runs post-tool-result compaction.</ns0:t>
+      </ns0:r>
+    </ns0:p>
+    <ns0:p>
+      <ns0:pPr>
+        <ns0:pStyle ns0:val="ListNumber"/>
+      </ns0:pPr>
+      <ns0:r>
+        <ns0:t>Engine returns CallModel again (with tool results now in the session history). Loop continues.</ns0:t>
+      </ns0:r>
+    </ns0:p>
+    <ns0:p>
+      <ns0:pPr>
+        <ns0:pStyle ns0:val="ListNumber"/>
+      </ns0:pPr>
+      <ns0:r>
+        <ns0:t>When the model returns with no tool calls and finish_reason=Stop, the engine checks for pending artifact finalization, then returns Finished.</ns0:t>
+      </ns0:r>
+    </ns0:p>
+    <ns0:p>
+      <ns0:pPr>
+        <ns0:pStyle ns0:val="ListNumber"/>
+      </ns0:pPr>
+      <ns0:r>
+        <ns0:t>RustAgentEngineAdapter emits AgentLoopEvent.Finished. Loop ends, UI shows final response.</ns0:t>
+      </ns0:r>
+    </ns0:p>
+    <ns0:p>
+      <ns0:pPr>
+        <ns0:pStyle ns0:val="Heading1"/>
+      </ns0:pPr>
+      <ns0:r>
+        <ns0:t>6. Compaction in Detail</ns0:t>
+      </ns0:r>
+    </ns0:p>
+    <ns0:p>
+      <ns0:pPr>
+        <ns0:pStyle ns0:val="Heading2"/>
+      </ns0:pPr>
+      <ns0:r>
+        <ns0:t>6.1 Token Pressure Estimation</ns0:t>
+      </ns0:r>
+    </ns0:p>
+    <ns0:p>
+      <ns0:r>
+        <ns0:rPr>
+          <ns0:b ns0:val="0"/>
+          <ns0:i ns0:val="0"/>
+          <ns0:sz ns0:val="22"/>
+        </ns0:rPr>
+        <ns0:t>The TokenLedger estimates total token usage by counting characters in all session messages, system prompt, and tool schemas, divided by a provider-specific ratio. This estimate is compared against context_window_tokens (from SessionIoParams) multiplied by the threshold_ratio from AgentConfig.</ns0:t>
+      </ns0:r>
+    </ns0:p>
+    <ns0:p>
+      <ns0:pPr>
+        <ns0:pStyle ns0:val="Heading2"/>
+      </ns0:pPr>
+      <ns0:r>
+        <ns0:t>6.2 ContextStore</ns0:t>
+      </ns0:r>
+    </ns0:p>
+    <ns0:p>
+      <ns0:r>
+        <ns0:rPr>
+          <ns0:b ns0:val="0"/>
+          <ns0:i ns0:val="0"/>
+          <ns0:sz ns0:val="22"/>
+        </ns0:rPr>
+        <ns0:t>The ContextStore is a virtual overlay that keeps large content out of the message history. Instead of stuffing huge tool results into the chat, the engine spills them to the context store and replaces them with a reference marker. Types of context references:</ns0:t>
+      </ns0:r>
+    </ns0:p>
+    <ns0:p>
+      <ns0:pPr>
+        <ns0:pStyle ns0:val="ListBullet"/>
+      </ns0:pPr>
+      <ns0:r>
+        <ns0:t>ToolOutput: Large tool results that exceeded spill thresholds</ns0:t>
+      </ns0:r>
+    </ns0:p>
+    <ns0:p>
+      <ns0:pPr>
+        <ns0:pStyle ns0:val="ListBullet"/>
+      </ns0:pPr>
+      <ns0:r>
+        <ns0:t>TerminalOutput: Terminal command output stored verbatim</ns0:t>
+      </ns0:r>
+    </ns0:p>
+    <ns0:p>
+      <ns0:pPr>
+        <ns0:pStyle ns0:val="ListBullet"/>
+      </ns0:pPr>
+      <ns0:r>
+        <ns0:t>HistorySnapshot: Snapshotted message ranges for summary compaction</ns0:t>
+      </ns0:r>
+    </ns0:p>
+    <ns0:p>
+      <ns0:pPr>
+        <ns0:pStyle ns0:val="ListBullet"/>
+      </ns0:pPr>
+      <ns0:r>
+        <ns0:t>ArtifactSnapshot: Artifact state at a point in time</ns0:t>
+      </ns0:r>
+    </ns0:p>
+    <ns0:p>
+      <ns0:pPr>
+        <ns0:pStyle ns0:val="ListBullet"/>
+      </ns0:pPr>
+      <ns0:r>
+        <ns0:t>FileOutline / FileChunk: Condensed file context for large documents</ns0:t>
+      </ns0:r>
+    </ns0:p>
+    <ns0:p>
+      <ns0:pPr>
+        <ns0:pStyle ns0:val="ListBullet"/>
+      </ns0:pPr>
+      <ns0:r>
+        <ns0:t>ToolSchema / ToolCatalogIndex: Tool schema deferral for small context models</ns0:t>
+      </ns0:r>
+    </ns0:p>
+    <ns0:p>
+      <ns0:pPr>
+        <ns0:pStyle ns0:val="Heading2"/>
+      </ns0:pPr>
+      <ns0:r>
+        <ns0:t>6.3 StateLedger</ns0:t>
+      </ns0:r>
+    </ns0:p>
+    <ns0:p>
+      <ns0:r>
+        <ns0:rPr>
+          <ns0:b ns0:val="0"/>
+          <ns0:i ns0:val="0"/>
+          <ns0:sz ns0:val="22"/>
+        </ns0:rPr>
+        <ns0:t>The StateLedger observes user and assistant messages and builds an "anchor message" -- a synthetic system message injected at the top of the session that summarizes known state (what files are open, what artifacts exist, what work is pending). This gives the model a compressed view of context without replaying the entire history.</ns0:t>
+      </ns0:r>
+    </ns0:p>
+    <ns0:p>
+      <ns0:pPr>
+        <ns0:pStyle ns0:val="Heading1"/>
+      </ns0:pPr>
+      <ns0:r>
+        <ns0:t>7. Standalone Policy Functions</ns0:t>
+      </ns0:r>
+    </ns0:p>
+    <ns0:p>
+      <ns0:r>
+        <ns0:rPr>
+          <ns0:b ns0:val="0"/>
+          <ns0:i ns0:val="0"/>
+          <ns0:sz ns0:val="22"/>
+        </ns0:rPr>
+        <ns0:t>In addition to the session engine, agent_core exports several standalone policy functions that Android code can call without creating a session:</ns0:t>
+      </ns0:r>
+    </ns0:p>
+    <ns0:p>
+      <ns0:pPr>
+        <ns0:pStyle ns0:val="ListBullet"/>
+      </ns0:pPr>
+      <ns0:r>
+        <ns0:t>repairTool(name, argsJson): Fuzzy-name repair and schema coercion for a single tool call.</ns0:t>
+      </ns0:r>
+    </ns0:p>
+    <ns0:p>
+      <ns0:pPr>
+        <ns0:pStyle ns0:val="ListBullet"/>
+      </ns0:pPr>
+      <ns0:r>
+        <ns0:t>truncateResult(json, budgetBytes): Truncate a tool result JSON to fit within a byte budget.</ns0:t>
+      </ns0:r>
+    </ns0:p>
+    <ns0:p>
+      <ns0:pPr>
+        <ns0:pStyle ns0:val="ListBullet"/>
+      </ns0:pPr>
+      <ns0:r>
+        <ns0:t>shouldAllowTool(softFailureStreak, maxStreak): Guardrail check for whether tool calls should be allowed.</ns0:t>
+      </ns0:r>
+    </ns0:p>
+    <ns0:p>
+      <ns0:pPr>
+        <ns0:pStyle ns0:val="ListBullet"/>
+      </ns0:pPr>
+      <ns0:r>
+        <ns0:t>resultJsonLooksSoftFailure(json): Heuristic check for soft-failure patterns in tool result JSON.</ns0:t>
+      </ns0:r>
+    </ns0:p>
+    <ns0:p>
+      <ns0:pPr>
+        <ns0:pStyle ns0:val="ListBullet"/>
+      </ns0:pPr>
+      <ns0:r>
+        <ns0:t>parseToolCalls(raw): Full envelope parsing pipeline (normalize, extract, repair, coerce, validate).</ns0:t>
+      </ns0:r>
+    </ns0:p>
+    <ns0:p>
+      <ns0:pPr>
+        <ns0:pStyle ns0:val="ListBullet"/>
+      </ns0:pPr>
+      <ns0:r>
+        <ns0:t>coerceProviderArguments(toolName, argsJson): Run only the coercion step on already-parsed tool arguments.</ns0:t>
+      </ns0:r>
+    </ns0:p>
+    <ns0:p>
+      <ns0:pPr>
+        <ns0:pStyle ns0:val="ListBullet"/>
+      </ns0:pPr>
+      <ns0:r>
+        <ns0:t>hasLocalToolContract(systemPrompt): Check whether a system prompt contains local tool markers.</ns0:t>
+      </ns0:r>
+    </ns0:p>
+    <ns0:p>
+      <ns0:pPr>
+        <ns0:pStyle ns0:val="ListBullet"/>
+      </ns0:pPr>
+      <ns0:r>
+        <ns0:t>createToolStreamGate(allowToolCall): Create a streaming parser instance for incremental tool-call detection.</ns0:t>
+      </ns0:r>
+    </ns0:p>
+    <ns0:p>
+      <ns0:pPr>
+        <ns0:pStyle ns0:val="Heading1"/>
+      </ns0:pPr>
+      <ns0:r>
+        <ns0:t>8. Key Configuration (AgentConfig)</ns0:t>
+      </ns0:r>
+    </ns0:p>
+    <ns0:p>
+      <ns0:r>
+        <ns0:rPr>
+          <ns0:b ns0:val="0"/>
+          <ns0:i ns0:val="0"/>
+          <ns0:sz ns0:val="22"/>
+        </ns0:rPr>
+        <ns0:t>The FfiAgentConfig / AgentConfig struct controls engine behavior:</ns0:t>
+      </ns0:r>
+    </ns0:p>
+    <ns0:p>
+      <ns0:pPr>
+        <ns0:pStyle ns0:val="ListBullet"/>
+      </ns0:pPr>
+      <ns0:r>
+        <ns0:t>maxTurns: Maximum tool-use turns before disabling tool calls (default varies by provider).</ns0:t>
+      </ns0:r>
+    </ns0:p>
+    <ns0:p>
+      <ns0:pPr>
+        <ns0:pStyle ns0:val="ListBullet"/>
+      </ns0:pPr>
+      <ns0:r>
+        <ns0:t>thresholdRatio / midTurnThresholdRatio / postToolResultThresholdRatio: Context pressure ratios that trigger compaction at different phases.</ns0:t>
+      </ns0:r>
+    </ns0:p>
+    <ns0:p>
+      <ns0:pPr>
+        <ns0:pStyle ns0:val="ListBullet"/>
+      </ns0:pPr>
+      <ns0:r>
+        <ns0:t>microKeepRecent: How many recent messages to protect from first-in-first-out eviction.</ns0:t>
+      </ns0:r>
+    </ns0:p>
+    <ns0:p>
+      <ns0:pPr>
+        <ns0:pStyle ns0:val="ListBullet"/>
+      </ns0:pPr>
+      <ns0:r>
+        <ns0:t>toolRetryLimit: Maximum consecutive soft-failure turns before disabling tools.</ns0:t>
+      </ns0:r>
+    </ns0:p>
+    <ns0:p>
+      <ns0:pPr>
+        <ns0:pStyle ns0:val="ListBullet"/>
+      </ns0:pPr>
+      <ns0:r>
+        <ns0:t>modelApiRetryLimit: Maximum transient model API retries per in-flight model turn (default 3). Retries re-issue the same pending request.</ns0:t>
+      </ns0:r>
+    </ns0:p>
+    <ns0:p>
+      <ns0:pPr>
+        <ns0:pStyle ns0:val="ListBullet"/>
+      </ns0:pPr>
+      <ns0:r>
+        <ns0:t>modelApiRetryBaseDelayMs: Base exponential backoff in milliseconds when the host does not supply retry_after_ms (default 1000; capped at 30000).</ns0:t>
+      </ns0:r>
+    </ns0:p>
+    <ns0:p>
+      <ns0:pPr>
+        <ns0:pStyle ns0:val="ListBullet"/>
+      </ns0:pPr>
+      <ns0:r>
+        <ns0:t>toolSpillThresholdBytes / terminalSpillThresholdBytes: Byte thresholds above which tool results are moved to ContextStore.</ns0:t>
+      </ns0:r>
+    </ns0:p>
+    <ns0:p>
+      <ns0:pPr>
+        <ns0:pStyle ns0:val="ListBullet"/>
+      </ns0:pPr>
+      <ns0:r>
+        <ns0:t>enableContextStore / enableStateLedger / enableToolSchemaDeferral / enableFileCondensation: Feature flags for context management.</ns0:t>
+      </ns0:r>
+    </ns0:p>
+    <ns0:p>
+      <ns0:pPr>
+        <ns0:pStyle ns0:val="ListBullet"/>
+      </ns0:pPr>
+      <ns0:r>
+        <ns0:t>enableManualCompact: Allow user-triggered compaction from the UI.</ns0:t>
+      </ns0:r>
+    </ns0:p>
+    <ns0:p>
+      <ns0:pPr>
+        <ns0:pStyle ns0:val="ListBullet"/>
+      </ns0:pPr>
+      <ns0:r>
+        <ns0:t>enableLoopHooks / enablePendingWorkGuard: Lifecycle hooks and doom-loop prevention.</ns0:t>
+      </ns0:r>
+    </ns0:p>
+    <ns0:p>
+      <ns0:pPr>
+        <ns0:pStyle ns0:val="Heading1"/>
+      </ns0:pPr>
+      <ns0:r>
+        <ns0:t>9. Error Handling and Self-Healing</ns0:t>
+      </ns0:r>
+    </ns0:p>
+    <ns0:p>
+      <ns0:r>
+        <ns0:rPr>
+          <ns0:b ns0:val="0"/>
+          <ns0:i ns0:val="0"/>
+          <ns0:sz ns0:val="22"/>
+        </ns0:rPr>
+        <ns0:t>The engine has multiple self-healing mechanisms:</ns0:t>
+      </ns0:r>
+    </ns0:p>
+    <ns0:p>
+      <ns0:pPr>
+        <ns0:pStyle ns0:val="ListBullet"/>
+      </ns0:pPr>
+      <ns0:r>
+        <ns0:t>Tool name repair: Fuzzy matching corrects misspelled tool names (e.g., "web_seach" becomes "web_search").</ns0:t>
+      </ns0:r>
+    </ns0:p>
+    <ns0:p>
+      <ns0:pPr>
+        <ns0:pStyle ns0:val="ListBullet"/>
+      </ns0:pPr>
+      <ns0:r>
+        <ns0:t>Envelope parse failure recovery: If the model outputs malformed tool envelopes, the engine injects error messages and lets the model try again rather than crashing.</ns0:t>
+      </ns0:r>
+    </ns0:p>
+    <ns0:p>
+      <ns0:pPr>
+        <ns0:pStyle ns0:val="ListBullet"/>
+      </ns0:pPr>
+      <ns0:r>
+        <ns0:t>Model API transport retry: When a provider inference call fails in Kotlin (timeouts, upstream idle timeouts, rate limits, 502/503), ModelTurnFailureClassifier maps the error to a ModelTurnFailureReport and calls submit_model_turn_failure() instead of ending the loop. Rust preserves the pending ModelRequest, emits ModelApiRetryScheduled, and re-issues CallModel with retry_after_ms backoff. Transient failures retry up to model_api_retry_limit (default 3); permanent failures (401, invalid API key) terminate immediately with ModelApiUnavailable; exhausted retries fail with model_api_retries_exhausted. consecutive_model_api_failures resets on successful submit_model_response.</ns0:t>
+      </ns0:r>
+    </ns0:p>
+    <ns0:p>
+      <ns0:pPr>
+        <ns0:pStyle ns0:val="ListBullet"/>
+      </ns0:pPr>
+      <ns0:r>
+        <ns0:t>Soft-failure detection: Tool results that indicate recoverable errors (rate limits, transient failures) are tracked as soft failures. If too many accumulate, tool calls are disabled gracefully.</ns0:t>
+      </ns0:r>
+    </ns0:p>
+    <ns0:p>
+      <ns0:pPr>
+        <ns0:pStyle ns0:val="ListBullet"/>
+      </ns0:pPr>
+      <ns0:r>
+        <ns0:t>Compaction fallbacks: If the preferred compaction tier isn't available (e.g., summarization not allowed), the engine tries less aggressive tiers. If no tier reduces context enough, it fails with a CompactionFailed error.</ns0:t>
+      </ns0:r>
+    </ns0:p>
+    <ns0:p>
+      <ns0:pPr>
+        <ns0:pStyle ns0:val="ListBullet"/>
+      </ns0:pPr>
+      <ns0:r>
+        <ns0:t>Artifact auto-finalization: When the model finishes with open artifacts, synthetic finalize calls are generated automatically to ensure artifacts are properly closed.</ns0:t>
+      </ns0:r>
+    </ns0:p>
+    <ns0:p>
+      <ns0:pPr>
+        <ns0:pStyle ns0:val="Heading1"/>
+      </ns0:pPr>
+      <ns0:r>
+        <ns0:t>10. Threading Model</ns0:t>
+      </ns0:r>
+    </ns0:p>
+    <ns0:p>
+      <ns0:r>
+        <ns0:rPr>
+          <ns0:b ns0:val="0"/>
+          <ns0:i ns0:val="0"/>
+          <ns0:sz ns0:val="22"/>
+        </ns0:rPr>
+        <ns0:t>Rust calls Kotlin callbacks on the caller thread (often a JNI worker). Heavy work must use Dispatchers.IO. RustAgentEngineAdapter explicitly dispatches host suspend callbacks onto Dispatchers.IO via withContext(Dispatchers.IO) before invoking model, tool, or summary work.</ns0:t>
+      </ns0:r>
+    </ns0:p>
+    <ns0:p>
+      <ns0:r>
+        <ns0:rPr>
+          <ns0:b ns0:val="0"/>
+          <ns0:i ns0:val="0"/>
+          <ns0:sz ns0:val="22"/>
+        </ns0:rPr>
+        <ns0:t>The Rust engine itself is thread-safe: SessionHandle uses a Mutex&lt;InnerSession&gt; so next_action(), submit_model_response(), and other mutations are serialized. The Kotlin adapter maintains activeEngine, activeSession, and activeHost references that are cleared in the finally block of the channelFlow.</ns0:t>
+      </ns0:r>
+    </ns0:p>
+    <ns0:p>
+      <ns0:pPr>
+        <ns0:pStyle ns0:val="Heading1"/>
+      </ns0:pPr>
+      <ns0:r>
+        <ns0:t>11. Binding Regeneration</ns0:t>
+      </ns0:r>
+    </ns0:p>
+    <ns0:p>
+      <ns0:r>
+        <ns0:rPr>
+          <ns0:b ns0:val="0"/>
+          <ns0:i ns0:val="0"/>
+          <ns0:sz ns0:val="22"/>
+        </ns0:rPr>
+        <ns0:t>When the Rust FFI surface changes:</ns0:t>
+      </ns0:r>
+    </ns0:p>
+    <ns0:p>
+      <ns0:pPr>
+        <ns0:pStyle ns0:val="ListNumber"/>
+      </ns0:pPr>
+      <ns0:r>
+        <ns0:t>Modify Rust types/functions in third_party/agent_core/src/ffi/.</ns0:t>
+      </ns0:r>
+    </ns0:p>
+    <ns0:p>
+      <ns0:pPr>
+        <ns0:pStyle ns0:val="ListNumber"/>
+      </ns0:pPr>
+      <ns0:r>
+        <ns0:t>Bump the version in third_party/agent_core/Cargo.toml (semver).</ns0:t>
+      </ns0:r>
+    </ns0:p>
+    <ns0:p>
+      <ns0:pPr>
+        <ns0:pStyle ns0:val="ListNumber"/>
+      </ns0:pPr>
+      <ns0:r>
+        <ns0:t>Run scripts/build-agent-bindings.sh to regenerate agent_core.kt and libagent_core.so.</ns0:t>
+      </ns0:r>
+    </ns0:p>
+    <ns0:p>
+      <ns0:pPr>
+        <ns0:pStyle ns0:val="ListNumber"/>
+      </ns0:pPr>
+      <ns0:r>
+        <ns0:t>Commit the Rust source, generated bindings, and native libraries together.</ns0:t>
+      </ns0:r>
+    </ns0:p>
+    <ns0:p>
+      <ns0:pPr>
+        <ns0:pStyle ns0:val="ListNumber"/>
+      </ns0:pPr>
+      <ns0:r>
+        <ns0:t>Run cargo test in third_party/agent_core and ./gradlew :core:agent:assembleDebug for verification.</ns0:t>
+      </ns0:r>
+    </ns0:p>
+    <ns0:p>
+      <ns0:pPr>
+        <ns0:pStyle ns0:val="Heading1"/>
+      </ns0:pPr>
+      <ns0:r>
+        <ns0:t>12. Visual Summary: Data Flow</ns0:t>
+      </ns0:r>
+    </ns0:p>
+    <ns0:p>
+      <ns0:r>
+        <ns0:rPr>
+          <ns0:b/>
+          <ns0:i ns0:val="0"/>
+          <ns0:sz ns0:val="22"/>
+        </ns0:rPr>
+        <ns0:t>The following text diagram shows the core data flow through the system:</ns0:t>
+      </ns0:r>
+    </ns0:p>
+    <ns0:p>
+      <ns0:r>
+        <ns0:rPr>
+          <ns0:rFonts ns0:ascii="Consolas" ns0:hAnsi="Consolas"/>
+          <ns0:sz ns0:val="18"/>
+        </ns0:rPr>
+        <ns0:t>User Message</ns0:t>
+        <ns0:br/>
+        <ns0:t xml:space="preserve">     |</ns0:t>
+        <ns0:br/>
+        <ns0:t xml:space="preserve">     v</ns0:t>
+        <ns0:br/>
+        <ns0:t>ConversationManagerImpl</ns0:t>
+        <ns0:br/>
+        <ns0:t xml:space="preserve">     |  constructs AgentLoopConfig + AgentLoopHostCallbacks</ns0:t>
+        <ns0:br/>
+        <ns0:t xml:space="preserve">     v</ns0:t>
+        <ns0:br/>
+        <ns0:t>RustAgentEngineAdapter.execute()</ns0:t>
+        <ns0:br/>
+        <ns0:t xml:space="preserve">     |  creates FfiAgentEngine + FfiSession</ns0:t>
+        <ns0:br/>
+        <ns0:t xml:space="preserve">     |  enters while(true) loop</ns0:t>
+        <ns0:br/>
+        <ns0:t xml:space="preserve">     v</ns0:t>
+        <ns0:br/>
+        <ns0:t>+--- FfiAgentEngine.next_action() --------------------------------+</ns0:t>
+        <ns0:br/>
+        <ns0:t>|                                                                    |</ns0:t>
+        <ns0:br/>
+        <ns0:t>|  +-- Idle -----------------------------------------------------+  |</ns0:t>
+        <ns0:br/>
+        <ns0:t>|  |  Run preflight compaction (if needed)                      |  |</ns0:t>
+        <ns0:br/>
+        <ns0:t>|  |  Build ModelRequest (messages + system + tools + context)  |  |</ns0:t>
+        <ns0:br/>
+        <ns0:t>|  |  -&gt; Return CallModel                                        |  |</ns0:t>
+        <ns0:br/>
+        <ns0:t>|  +-------------------------------------------------------------+  |</ns0:t>
+        <ns0:br/>
+        <ns0:t>|                                                                    |</ns0:t>
+        <ns0:br/>
+        <ns0:t>|  +-- AwaitingModel --------------------------------------------+  |</ns0:t>
+        <ns0:br/>
+        <ns0:t>|  |  Return pending CallModel request                           |  |</ns0:t>
+        <ns0:br/>
+        <ns0:t>|  +-------------------------------------------------------------+  |</ns0:t>
+        <ns0:br/>
+        <ns0:t>|                                                                    |</ns0:t>
+        <ns0:br/>
+        <ns0:t>|  Kotlin calls host.completeModelTurn() on Dispatchers.IO          |</ns0:t>
+        <ns0:br/>
+        <ns0:t>|  Then calls engine.submit_model_response(response)                 |</ns0:t>
+        <ns0:br/>
+        <ns0:t>|                                                                    |</ns0:t>
+        <ns0:br/>
+        <ns0:t>|  +-- Processing Model Response --------------------------------+   |</ns0:t>
+        <ns0:br/>
+        <ns0:t>|  |  1. Envelope parsing (extract tool calls from text)        |   |</ns0:t>
+        <ns0:br/>
+        <ns0:t>|  |  2. Tool repair (name normalization, schema coercion)      |   |</ns0:t>
+        <ns0:br/>
+        <ns0:t>|  |  3. Guardrail checks (max turns, soft failures)             |   |</ns0:t>
+        <ns0:br/>
+        <ns0:t>|  |  4. Mid-turn compaction (if needed)                         |   |</ns0:t>
+        <ns0:br/>
+        <ns0:t>|  |  5. -&gt; Return ExecuteTools or Finished                      |   |</ns0:t>
+        <ns0:br/>
+        <ns0:t>|  +-------------------------------------------------------------+   |</ns0:t>
+        <ns0:br/>
+        <ns0:t>|                                                                    |</ns0:t>
+        <ns0:br/>
+        <ns0:t>|  +-- AwaitingTools --------------------------------------------+  |</ns0:t>
+        <ns0:br/>
+        <ns0:t>|  |  Return pending tool call list                              |  |</ns0:t>
+        <ns0:br/>
+        <ns0:t>|  +-------------------------------------------------------------+  |</ns0:t>
+        <ns0:br/>
+        <ns0:t>|                                                                    |</ns0:t>
+        <ns0:br/>
+        <ns0:t>|  Kotlin calls host.execute_tools() on Dispatchers.IO               |</ns0:t>
+        <ns0:br/>
+        <ns0:t>|  Then calls engine.submit_tool_results(results)                     |</ns0:t>
+        <ns0:br/>
+        <ns0:t>|                                                                    |</ns0:t>
+        <ns0:br/>
+        <ns0:t>|  +-- Processing Tool Results ----------------------------------+   |</ns0:t>
+        <ns0:br/>
+        <ns0:t>|  |  1. Tool result truncation (budget enforcement)             |   |</ns0:t>
+        <ns0:br/>
+        <ns0:t>|  |  2. Context spilling (large results -&gt; ContextStore)        |   |</ns0:t>
+        <ns0:br/>
+        <ns0:t>|  |  3. Post-tool-result compaction (if needed)                  |   |</ns0:t>
+        <ns0:br/>
+        <ns0:t>|  |  4. Artifact finalization (if model finished)                |   |</ns0:t>
+        <ns0:br/>
+        <ns0:t>|  |  5. -&gt; Return CallModel (continue) or Finished (done)        |   |</ns0:t>
+        <ns0:br/>
+        <ns0:t>|  +-------------------------------------------------------------+   |</ns0:t>
+        <ns0:br/>
+        <ns0:t>|                                                                    |</ns0:t>
+        <ns0:br/>
+        <ns0:t>|  +-- AwaitingSummary ------------------------------------------+  |</ns0:t>
+        <ns0:br/>
+        <ns0:t>|  |  Return pending summary request                             |  |</ns0:t>
+        <ns0:br/>
+        <ns0:t>|  +-------------------------------------------------------------+  |</ns0:t>
+        <ns0:br/>
+        <ns0:t>|                                                                    |</ns0:t>
+        <ns0:br/>
+        <ns0:t>|  Kotlin calls host.summarize() on Dispatchers.IO                   |</ns0:t>
+        <ns0:br/>
+        <ns0:t>|  Then calls engine.submit_summary(result)                            |</ns0:t>
+        <ns0:br/>
+        <ns0:t>|                                                                    |</ns0:t>
+        <ns0:br/>
+        <ns0:t>|  -&gt; Back to Idle (loop continues)                                  |</ns0:t>
+        <ns0:br/>
+        <ns0:t>|                                                                    |</ns0:t>
+        <ns0:br/>
+        <ns0:t>|  +-- Finished / Failed -----------------------------------------+ |</ns0:t>
+        <ns0:br/>
+        <ns0:t>|  |  Session complete, exit loop                                |  |</ns0:t>
+        <ns0:br/>
+        <ns0:t>|  +-------------------------------------------------------------+  |</ns0:t>
+        <ns0:br/>
+        <ns0:t>|                                                                    |</ns0:t>
+        <ns0:br/>
+        <ns0:t>+--------------------------------------------------------------------+</ns0:t>
+        <ns0:br/>
+        <ns0:br/>
+        <ns0:t>drain_events() is called after each action to collect:</ns0:t>
+        <ns0:br/>
+        <ns0:t xml:space="preserve">  TurnStarted, TurnCompleted, CompactionApplied, ToolRepaired,</ns0:t>
+        <ns0:br/>
+        <ns0:t xml:space="preserve">  KvCacheInvalidated, PreCompact, PostCompact, ContextPressure, etc.</ns0:t>
+      </ns0:r>
+    </ns0:p>
+    <ns0:p>
+      <ns0:pPr>
+        <ns0:pStyle ns0:val="Heading1"/>
+      </ns0:pPr>
+      <ns0:r>
+        <ns0:t>13. Module Map</ns0:t>
+      </ns0:r>
+    </ns0:p>
+    <ns0:p>
+      <ns0:r>
+        <ns0:rPr>
+          <ns0:b/>
+          <ns0:i ns0:val="0"/>
+          <ns0:sz ns0:val="22"/>
+        </ns0:rPr>
+        <ns0:t>Rust Modules (third_party/agent_core/src/):</ns0:t>
+      </ns0:r>
+    </ns0:p>
+    <ns0:p>
+      <ns0:pPr>
+        <ns0:pStyle ns0:val="ListBullet"/>
+      </ns0:pPr>
+      <ns0:r>
+        <ns0:t>action.rs -- AgentAction enum (CallModel, ExecuteTools, RequestSummary, Finished, Failed)</ns0:t>
+      </ns0:r>
+    </ns0:p>
+    <ns0:p>
+      <ns0:pPr>
+        <ns0:pStyle ns0:val="ListBullet"/>
+      </ns0:pPr>
+      <ns0:r>
+        <ns0:t>engine/mod.rs -- AgentEngine state machine, session lifecycle, submit-style API</ns0:t>
+      </ns0:r>
+    </ns0:p>
+    <ns0:p>
+      <ns0:pPr>
+        <ns0:pStyle ns0:val="ListBullet"/>
+      </ns0:pPr>
+      <ns0:r>
+        <ns0:t>engine/state.rs -- InnerSession, EnginePhase, SessionHandle</ns0:t>
+      </ns0:r>
+    </ns0:p>
+    <ns0:p>
+      <ns0:pPr>
+        <ns0:pStyle ns0:val="ListBullet"/>
+      </ns0:pPr>
+      <ns0:r>
+        <ns0:t>host.rs -- AgentTransport, AgentToolExecutor, AgentSummarizer trait definitions</ns0:t>
+      </ns0:r>
+    </ns0:p>
+    <ns0:p>
+      <ns0:pPr>
+        <ns0:pStyle ns0:val="ListBullet"/>
+      </ns0:pPr>
+      <ns0:r>
+        <ns0:t>tool_parse/ -- Envelope parsing (XML, JSON, DSML, CDATA, Mistral, GLM formats)</ns0:t>
+      </ns0:r>
+    </ns0:p>
+    <ns0:p>
+      <ns0:pPr>
+        <ns0:pStyle ns0:val="ListBullet"/>
+      </ns0:pPr>
+      <ns0:r>
+        <ns0:t>repair/ -- ToolRepairPipeline: name normalization, fuzzy matching, schema coercion</ns0:t>
+      </ns0:r>
+    </ns0:p>
+    <ns0:p>
+      <ns0:pPr>
+        <ns0:pStyle ns0:val="ListBullet"/>
+      </ns0:pPr>
+      <ns0:r>
+        <ns0:t>catalog.rs -- ToolCatalog: global registry of known tool names and schema hints</ns0:t>
+      </ns0:r>
+    </ns0:p>
+    <ns0:p>
+      <ns0:pPr>
+        <ns0:pStyle ns0:val="ListBullet"/>
+      </ns0:pPr>
+      <ns0:r>
+        <ns0:t>compact/ -- Compaction tiers: micro, fifo, artifact_squash, summary, tool_spill, history_snapshot</ns0:t>
+      </ns0:r>
+    </ns0:p>
+    <ns0:p>
+      <ns0:pPr>
+        <ns0:pStyle ns0:val="ListBullet"/>
+      </ns0:pPr>
+      <ns0:r>
+        <ns0:t>guardrails.rs -- GuardrailState: turn limits, soft-failure tracking, tool policy</ns0:t>
+      </ns0:r>
+    </ns0:p>
+    <ns0:p>
+      <ns0:pPr>
+        <ns0:pStyle ns0:val="ListBullet"/>
+      </ns0:pPr>
+      <ns0:r>
+        <ns0:t>budget.rs -- TokenLedger: token estimation and context pressure calculation</ns0:t>
+      </ns0:r>
+    </ns0:p>
+    <ns0:p>
+      <ns0:pPr>
+        <ns0:pStyle ns0:val="ListBullet"/>
+      </ns0:pPr>
+      <ns0:r>
+        <ns0:t>context_store.rs -- ContextStore: virtual context references for large content</ns0:t>
+      </ns0:r>
+    </ns0:p>
+    <ns0:p>
+      <ns0:pPr>
+        <ns0:pStyle ns0:val="ListBullet"/>
+      </ns0:pPr>
+      <ns0:r>
+        <ns0:t>state_ledger.rs -- StateLedger: state anchor construction from message history</ns0:t>
+      </ns0:r>
+    </ns0:p>
+    <ns0:p>
+      <ns0:pPr>
+        <ns0:pStyle ns0:val="ListBullet"/>
+      </ns0:pPr>
+      <ns0:r>
+        <ns0:t>session.rs -- AgentSession, AgentConfig, SessionCapabilities</ns0:t>
+      </ns0:r>
+    </ns0:p>
+    <ns0:p>
+      <ns0:pPr>
+        <ns0:pStyle ns0:val="ListBullet"/>
+      </ns0:pPr>
+      <ns0:r>
+        <ns0:t>message.rs -- AgentMessage, AgentRole, ToolCallRecord, ToolResultRecord</ns0:t>
+      </ns0:r>
+    </ns0:p>
+    <ns0:p>
+      <ns0:pPr>
+        <ns0:pStyle ns0:val="ListBullet"/>
+      </ns0:pPr>
+      <ns0:r>
+        <ns0:t>turn_io.rs -- ModelRequest, ModelResponse, RawToolCall, FinishReason, SummaryRequest/Result</ns0:t>
+      </ns0:r>
+    </ns0:p>
+    <ns0:p>
+      <ns0:pPr>
+        <ns0:pStyle ns0:val="ListBullet"/>
+      </ns0:pPr>
+      <ns0:r>
+        <ns0:t>events.rs -- AgentEvent enum, CompactionTrigger, CompactionTier, AgentError</ns0:t>
+      </ns0:r>
+    </ns0:p>
+    <ns0:p>
+      <ns0:pPr>
+        <ns0:pStyle ns0:val="ListBullet"/>
+      </ns0:pPr>
+      <ns0:r>
+        <ns0:t>ffi/ -- UniFFI adapter layer (types, callbacks, policy_bridge, stream_gate)</ns0:t>
+      </ns0:r>
+    </ns0:p>
+    <ns0:p>
+      <ns0:pPr>
+        <ns0:pStyle ns0:val="ListBullet"/>
+      </ns0:pPr>
+      <ns0:r>
+        <ns0:t>tool_stream_gate/ -- Streaming tool-call detection for token-by-token parsing</ns0:t>
+      </ns0:r>
+    </ns0:p>
+    <ns0:p>
+      <ns0:pPr>
+        <ns0:pStyle ns0:val="ListBullet"/>
+      </ns0:pPr>
+      <ns0:r>
+        <ns0:t>truncate.rs -- Tool result JSON truncation</ns0:t>
+      </ns0:r>
+    </ns0:p>
+    <ns0:p>
+      <ns0:pPr>
+        <ns0:pStyle ns0:val="ListBullet"/>
+      </ns0:pPr>
+      <ns0:r>
+        <ns0:t>manual_compact.rs -- User-initiated compaction flow</ns0:t>
+      </ns0:r>
+    </ns0:p>
+    <ns0:p>
+      <ns0:pPr>
+        <ns0:pStyle ns0:val="ListBullet"/>
+      </ns0:pPr>
+      <ns0:r>
+        <ns0:t>artifact_finalize.rs -- Auto-finalization of open artifacts on session end</ns0:t>
+      </ns0:r>
+    </ns0:p>
+    <ns0:p>
+      <ns0:pPr>
+        <ns0:pStyle ns0:val="ListBullet"/>
+      </ns0:pPr>
+      <ns0:r>
+        <ns0:t>request_pipeline.rs -- Runtime tool catalog rendering and context preparation</ns0:t>
+      </ns0:r>
+    </ns0:p>
+    <ns0:p>
+      <ns0:r>
+        <ns0:rPr>
+          <ns0:b/>
+          <ns0:i ns0:val="0"/>
+          <ns0:sz ns0:val="22"/>
+        </ns0:rPr>
+        <ns0:t>Kotlin Modules (core/agent/src/main/kotlin/):</ns0:t>
+      </ns0:r>
+    </ns0:p>
+    <ns0:p>
+      <ns0:pPr>
+        <ns0:pStyle ns0:val="ListBullet"/>
+      </ns0:pPr>
+      <ns0:r>
+        <ns0:t>RustAgentEngineAdapter.kt -- Primary orchestrator implementing AgentLoopPort, drives the submit-style loop</ns0:t>
+      </ns0:r>
+    </ns0:p>
+    <ns0:p>
+      <ns0:pPr>
+        <ns0:pStyle ns0:val="ListBullet"/>
+      </ns0:pPr>
+      <ns0:r>
+        <ns0:t>AgentEngineActionDriver.kt -- Alternative driver that processes a flat list of actions (used for test replay)</ns0:t>
+      </ns0:r>
+    </ns0:p>
+    <ns0:p>
+      <ns0:pPr>
+        <ns0:pStyle ns0:val="ListBullet"/>
+      </ns0:pPr>
+      <ns0:r>
+        <ns0:t>AgentEventMapper.kt -- Maps FfiAgentEvent to domain AgentLoopEvent, logs telemetry</ns0:t>
+      </ns0:r>
+    </ns0:p>
+    <ns0:p>
+      <ns0:pPr>
+        <ns0:pStyle ns0:val="ListBullet"/>
+      </ns0:pPr>
+      <ns0:r>
+        <ns0:t>RustToolEnvelopeParser.kt -- ToolEnvelopeParserPort implementation delegating to Rust parse_tool_calls()</ns0:t>
+      </ns0:r>
+    </ns0:p>
+    <ns0:p>
+      <ns0:pPr>
+        <ns0:pStyle ns0:val="ListBullet"/>
+      </ns0:pPr>
+      <ns0:r>
+        <ns0:t>RustToolStreamGate.kt -- ToolStreamGatePort implementation for streaming tool detection</ns0:t>
+      </ns0:r>
+    </ns0:p>
+    <ns0:p>
+      <ns0:pPr>
+        <ns0:pStyle ns0:val="ListBullet"/>
+      </ns0:pPr>
+      <ns0:r>
+        <ns0:t>LiteRtAgentPolicyBridge.kt -- AgentPolicyPort implementation delegating to Rust repair/truncate/shouldAllow functions</ns0:t>
+      </ns0:r>
+    </ns0:p>
+    <ns0:p>
+      <ns0:pPr>
+        <ns0:pStyle ns0:val="ListBullet"/>
+      </ns0:pPr>
+      <ns0:r>
+        <ns0:t>AgentModule.kt -- Hilt DI module that wires up agent module dependencies</ns0:t>
+      </ns0:r>
+    </ns0:p>
+    <ns0:p>
+      <ns0:r>
+        <ns0:rPr>
+          <ns0:b/>
+          <ns0:i ns0:val="0"/>
+          <ns0:sz ns0:val="22"/>
+        </ns0:rPr>
+        <ns0:t>Kotlin Modules (feature/inference/src/main/kotlin/):</ns0:t>
+      </ns0:r>
+    </ns0:p>
+    <ns0:p>
+      <ns0:pPr>
+        <ns0:pStyle ns0:val="ListBullet"/>
+      </ns0:pPr>
+      <ns0:r>
+        <ns0:t>ConversationManagerImpl.kt -- Manages chat sessions, wires up inference services and the agent loop</ns0:t>
+      </ns0:r>
+    </ns0:p>
+    <ns0:p>
+      <ns0:pPr>
+        <ns0:pStyle ns0:val="ListBullet"/>
+      </ns0:pPr>
+      <ns0:r>
+        <ns0:t>RustLoopInferenceService.kt -- InferenceService that delegates to RustAgentEngineAdapter for the full agent loop</ns0:t>
+      </ns0:r>
+    </ns0:p>
+    <ns0:p>
+      <ns0:pPr>
+        <ns0:pStyle ns0:val="ListBullet"/>
+      </ns0:pPr>
+      <ns0:r>
+        <ns0:t>LiteRtInferenceServiceImpl.kt -- On-device inference via LiteRT (Gemma, etc.)</ns0:t>
+      </ns0:r>
+    </ns0:p>
+    <ns0:p>
+      <ns0:pPr>
+        <ns0:pStyle ns0:val="ListBullet"/>
+      </ns0:pPr>
+      <ns0:r>
+        <ns0:t>LlamaInferenceServiceImpl.kt -- On-device inference via llama.cpp JNI</ns0:t>
+      </ns0:r>
+    </ns0:p>
+    <ns0:p>
+      <ns0:pPr>
+        <ns0:pStyle ns0:val="ListBullet"/>
+      </ns0:pPr>
+      <ns0:r>
+        <ns0:t>ApiInferenceServiceImpl.kt -- Cloud inference (OpenAI-compatible APIs)</ns0:t>
+      </ns0:r>
+    </ns0:p>
+    <ns0:p>
+      <ns0:pPr>
+        <ns0:pStyle ns0:val="ListBullet"/>
+      </ns0:pPr>
+      <ns0:r>
+        <ns0:t>ToolPromptComposer.kt / SearchToolPromptComposerImpl.kt -- Builds system prompts with tool descriptions</ns0:t>
+      </ns0:r>
+    </ns0:p>
+    <ns0:p>
+      <ns0:pPr>
+        <ns0:pStyle ns0:val="ListBullet"/>
+      </ns0:pPr>
+      <ns0:r>
+        <ns0:t>ToolStreamGateSession.kt -- Manages streaming tool call detection state per conversation turn</ns0:t>
+      </ns0:r>
+    </ns0:p>
+    <ns0:p>
+      <ns0:pPr>
+        <ns0:pStyle ns0:val="Heading1"/>
+      </ns0:pPr>
+      <ns0:r>
+        <ns0:t>14. Summary</ns0:t>
+      </ns0:r>
+    </ns0:p>
+    <ns0:p>
+      <ns0:r>
+        <ns0:rPr>
+          <ns0:b ns0:val="0"/>
+          <ns0:i ns0:val="0"/>
+          <ns0:sz ns0:val="22"/>
+        </ns0:rPr>
+        <ns0:t>The Pocket Crew agent architecture is a clear separation of concerns: the Rust agent_core engine owns all deterministic agent-loop logic (state machine, compaction, repair, guardrails, context management, model API retry policy), while the Kotlin/Android layer owns I/O (provider inference, tool execution, summarization, transport error classification, UI). The two communicate through a submit-style protocol over UniFFI, where Rust yields actions and Kotlin fulfills them. This design ensures that all policy decisions are made in one place (Rust) and are fully testable without an Android device, while the Android layer remains a thin orchestration shell that bridges engine requests to real services.</ns0:t>
+      </ns0:r>
+    </ns0:p>
+    <ns0:sectPr ns0:rsidR="00FC693F" ns0:rsidRPr="0006063C" ns0:rsidSect="00034616">
+      <ns0:pgSz ns0:w="12240" ns0:h="15840"/>
+      <ns0:pgMar ns0:top="1440" ns0:right="1440" ns0:bottom="1440" ns0:left="1440" ns0:header="720" ns0:footer="720" ns0:gutter="0"/>
+      <ns0:cols ns0:space="720"/>
+      <ns0:docGrid ns0:linePitch="360"/>
+    </ns0:sectPr>
+  </ns0:body>
+</ns0:document>
 </file>
 
 <file path=word/numbering.xml><?xml version="1.0" encoding="utf-8"?>

</xml_diff>